<commit_message>
Correcciones editoriales (ítems A–D, F), Monte Carlo en el Anexo 18 con su figura A18.1, figuras de anexos A8.1…, notas del Excel; tabla de cambios; PDF ES/EN de 20 páginas
Co-Authored-By: Claude Sonnet 5.5 <noreply@anthropic.com>
Claude-Session: https://claude.ai/code/session_0188QZHBkA8n5QL7BtmFakQg
</commit_message>
<xml_diff>
--- a/secciones/valuacion/anexo/Mallplaza_Valuacion_EN_Anexo.docx
+++ b/secciones/valuacion/anexo/Mallplaza_Valuacion_EN_Anexo.docx
@@ -27990,8 +27990,7 @@
       </w:tblPr>
       <w:tblGrid>
         <w:gridCol w:w="1100"/>
-        <w:gridCol w:w="5666"/>
-        <w:gridCol w:w="600"/>
+        <w:gridCol w:w="6266"/>
         <w:gridCol w:w="1100"/>
         <w:gridCol w:w="1200"/>
         <w:gridCol w:w="1000"/>
@@ -28036,7 +28035,7 @@
         </w:tc>
         <w:tc>
           <w:tcPr>
-            <w:tcW w:type="dxa" w:w="5666"/>
+            <w:tcW w:type="dxa" w:w="6266"/>
             <w:tcBorders>
               <w:top w:val="none" w:color="FFFFFF" w:sz="0"/>
               <w:left w:val="none" w:color="FFFFFF" w:sz="0"/>
@@ -28070,7 +28069,7 @@
         </w:tc>
         <w:tc>
           <w:tcPr>
-            <w:tcW w:type="dxa" w:w="600"/>
+            <w:tcW w:type="dxa" w:w="1100"/>
             <w:tcBorders>
               <w:top w:val="none" w:color="FFFFFF" w:sz="0"/>
               <w:left w:val="none" w:color="FFFFFF" w:sz="0"/>
@@ -28098,13 +28097,13 @@
                 <w:sz w:val="13"/>
                 <w:szCs w:val="13"/>
               </w:rPr>
-              <w:t xml:space="preserve">Prob.</w:t>
-            </w:r>
-          </w:p>
-        </w:tc>
-        <w:tc>
-          <w:tcPr>
-            <w:tcW w:type="dxa" w:w="1100"/>
+              <w:t xml:space="preserve">DCF (CLP)</w:t>
+            </w:r>
+          </w:p>
+        </w:tc>
+        <w:tc>
+          <w:tcPr>
+            <w:tcW w:type="dxa" w:w="1200"/>
             <w:tcBorders>
               <w:top w:val="none" w:color="FFFFFF" w:sz="0"/>
               <w:left w:val="none" w:color="FFFFFF" w:sz="0"/>
@@ -28132,13 +28131,13 @@
                 <w:sz w:val="13"/>
                 <w:szCs w:val="13"/>
               </w:rPr>
-              <w:t xml:space="preserve">DCF (CLP)</w:t>
-            </w:r>
-          </w:p>
-        </w:tc>
-        <w:tc>
-          <w:tcPr>
-            <w:tcW w:type="dxa" w:w="1200"/>
+              <w:t xml:space="preserve">Target price</w:t>
+            </w:r>
+          </w:p>
+        </w:tc>
+        <w:tc>
+          <w:tcPr>
+            <w:tcW w:type="dxa" w:w="1000"/>
             <w:tcBorders>
               <w:top w:val="none" w:color="FFFFFF" w:sz="0"/>
               <w:left w:val="none" w:color="FFFFFF" w:sz="0"/>
@@ -28166,7 +28165,153 @@
                 <w:sz w:val="13"/>
                 <w:szCs w:val="13"/>
               </w:rPr>
-              <w:t xml:space="preserve">Target price</w:t>
+              <w:t xml:space="preserve">vs price</w:t>
+            </w:r>
+          </w:p>
+        </w:tc>
+      </w:tr>
+      <w:tr>
+        <w:tc>
+          <w:tcPr>
+            <w:tcW w:type="dxa" w:w="1100"/>
+            <w:tcBorders>
+              <w:top w:val="none" w:color="FFFFFF" w:sz="0"/>
+              <w:left w:val="none" w:color="FFFFFF" w:sz="0"/>
+              <w:bottom w:val="single" w:color="D5D9E0" w:sz="4"/>
+              <w:right w:val="none" w:color="FFFFFF" w:sz="0"/>
+            </w:tcBorders>
+            <w:shd w:fill="F7F8FB" w:color="auto" w:val="clear"/>
+            <w:tcMar>
+              <w:top w:type="dxa" w:w="25"/>
+              <w:left w:type="dxa" w:w="80"/>
+              <w:bottom w:type="dxa" w:w="25"/>
+              <w:right w:type="dxa" w:w="80"/>
+            </w:tcMar>
+            <w:vAlign w:val="center"/>
+          </w:tcPr>
+          <w:p>
+            <w:pPr>
+              <w:spacing w:line="216" w:lineRule="auto"/>
+              <w:jc w:val="left"/>
+            </w:pPr>
+            <w:r>
+              <w:rPr>
+                <w:rFonts w:ascii="Arial" w:cs="Arial" w:eastAsia="Arial" w:hAnsi="Arial"/>
+                <w:b w:val="false"/>
+                <w:bCs w:val="false"/>
+                <w:color w:val="1A1A1A"/>
+                <w:sz w:val="13"/>
+                <w:szCs w:val="13"/>
+              </w:rPr>
+              <w:t xml:space="preserve">Bear</w:t>
+            </w:r>
+          </w:p>
+        </w:tc>
+        <w:tc>
+          <w:tcPr>
+            <w:tcW w:type="dxa" w:w="6266"/>
+            <w:tcBorders>
+              <w:top w:val="none" w:color="FFFFFF" w:sz="0"/>
+              <w:left w:val="none" w:color="FFFFFF" w:sz="0"/>
+              <w:bottom w:val="single" w:color="D5D9E0" w:sz="4"/>
+              <w:right w:val="none" w:color="FFFFFF" w:sz="0"/>
+            </w:tcBorders>
+            <w:shd w:fill="F7F8FB" w:color="auto" w:val="clear"/>
+            <w:tcMar>
+              <w:top w:type="dxa" w:w="25"/>
+              <w:left w:type="dxa" w:w="80"/>
+              <w:bottom w:type="dxa" w:w="25"/>
+              <w:right w:type="dxa" w:w="80"/>
+            </w:tcMar>
+            <w:vAlign w:val="center"/>
+          </w:tcPr>
+          <w:p>
+            <w:pPr>
+              <w:spacing w:line="216" w:lineRule="auto"/>
+              <w:jc w:val="left"/>
+            </w:pPr>
+            <w:r>
+              <w:rPr>
+                <w:rFonts w:ascii="Arial" w:cs="Arial" w:eastAsia="Arial" w:hAnsi="Arial"/>
+                <w:b w:val="false"/>
+                <w:bCs w:val="false"/>
+                <w:color w:val="1A1A1A"/>
+                <w:sz w:val="13"/>
+                <w:szCs w:val="13"/>
+              </w:rPr>
+              <w:t xml:space="preserve">Everything goes wrong: nominal WACC +100 bp in all periods; EBITDA margin 75.8%, occupancy 95.1%, same-store rent 2027–28 3.7%, tenant sales 3.7%, 2029–31 real growth at the Note 11 floor, visitors 5.6%, maintenance capex 6.6%</w:t>
+            </w:r>
+          </w:p>
+        </w:tc>
+        <w:tc>
+          <w:tcPr>
+            <w:tcW w:type="dxa" w:w="1100"/>
+            <w:tcBorders>
+              <w:top w:val="none" w:color="FFFFFF" w:sz="0"/>
+              <w:left w:val="none" w:color="FFFFFF" w:sz="0"/>
+              <w:bottom w:val="single" w:color="D5D9E0" w:sz="4"/>
+              <w:right w:val="none" w:color="FFFFFF" w:sz="0"/>
+            </w:tcBorders>
+            <w:shd w:fill="F7F8FB" w:color="auto" w:val="clear"/>
+            <w:tcMar>
+              <w:top w:type="dxa" w:w="25"/>
+              <w:left w:type="dxa" w:w="80"/>
+              <w:bottom w:type="dxa" w:w="25"/>
+              <w:right w:type="dxa" w:w="80"/>
+            </w:tcMar>
+            <w:vAlign w:val="center"/>
+          </w:tcPr>
+          <w:p>
+            <w:pPr>
+              <w:spacing w:line="216" w:lineRule="auto"/>
+              <w:jc w:val="right"/>
+            </w:pPr>
+            <w:r>
+              <w:rPr>
+                <w:rFonts w:ascii="Arial" w:cs="Arial" w:eastAsia="Arial" w:hAnsi="Arial"/>
+                <w:b w:val="false"/>
+                <w:bCs w:val="false"/>
+                <w:color w:val="1A1A1A"/>
+                <w:sz w:val="13"/>
+                <w:szCs w:val="13"/>
+              </w:rPr>
+              <w:t xml:space="preserve">1,190</w:t>
+            </w:r>
+          </w:p>
+        </w:tc>
+        <w:tc>
+          <w:tcPr>
+            <w:tcW w:type="dxa" w:w="1200"/>
+            <w:tcBorders>
+              <w:top w:val="none" w:color="FFFFFF" w:sz="0"/>
+              <w:left w:val="none" w:color="FFFFFF" w:sz="0"/>
+              <w:bottom w:val="single" w:color="D5D9E0" w:sz="4"/>
+              <w:right w:val="none" w:color="FFFFFF" w:sz="0"/>
+            </w:tcBorders>
+            <w:shd w:fill="F7F8FB" w:color="auto" w:val="clear"/>
+            <w:tcMar>
+              <w:top w:type="dxa" w:w="25"/>
+              <w:left w:type="dxa" w:w="80"/>
+              <w:bottom w:type="dxa" w:w="25"/>
+              <w:right w:type="dxa" w:w="80"/>
+            </w:tcMar>
+            <w:vAlign w:val="center"/>
+          </w:tcPr>
+          <w:p>
+            <w:pPr>
+              <w:spacing w:line="216" w:lineRule="auto"/>
+              <w:jc w:val="right"/>
+            </w:pPr>
+            <w:r>
+              <w:rPr>
+                <w:rFonts w:ascii="Arial" w:cs="Arial" w:eastAsia="Arial" w:hAnsi="Arial"/>
+                <w:b w:val="false"/>
+                <w:bCs w:val="false"/>
+                <w:color w:val="1A1A1A"/>
+                <w:sz w:val="13"/>
+                <w:szCs w:val="13"/>
+              </w:rPr>
+              <w:t xml:space="preserve">1,542</w:t>
             </w:r>
           </w:p>
         </w:tc>
@@ -28176,31 +28321,215 @@
             <w:tcBorders>
               <w:top w:val="none" w:color="FFFFFF" w:sz="0"/>
               <w:left w:val="none" w:color="FFFFFF" w:sz="0"/>
-              <w:bottom w:val="none" w:color="FFFFFF" w:sz="0"/>
-              <w:right w:val="none" w:color="FFFFFF" w:sz="0"/>
-            </w:tcBorders>
-            <w:shd w:fill="14284B" w:color="auto" w:val="clear"/>
-            <w:tcMar>
-              <w:top w:type="dxa" w:w="35"/>
-              <w:left w:type="dxa" w:w="80"/>
-              <w:bottom w:type="dxa" w:w="35"/>
-              <w:right w:type="dxa" w:w="80"/>
-            </w:tcMar>
-          </w:tcPr>
-          <w:p>
-            <w:pPr>
-              <w:jc w:val="right"/>
+              <w:bottom w:val="single" w:color="D5D9E0" w:sz="4"/>
+              <w:right w:val="none" w:color="FFFFFF" w:sz="0"/>
+            </w:tcBorders>
+            <w:shd w:fill="F7F8FB" w:color="auto" w:val="clear"/>
+            <w:tcMar>
+              <w:top w:type="dxa" w:w="25"/>
+              <w:left w:type="dxa" w:w="80"/>
+              <w:bottom w:type="dxa" w:w="25"/>
+              <w:right w:type="dxa" w:w="80"/>
+            </w:tcMar>
+            <w:vAlign w:val="center"/>
+          </w:tcPr>
+          <w:p>
+            <w:pPr>
+              <w:spacing w:line="216" w:lineRule="auto"/>
+              <w:jc w:val="right"/>
+            </w:pPr>
+            <w:r>
+              <w:rPr>
+                <w:rFonts w:ascii="Arial" w:cs="Arial" w:eastAsia="Arial" w:hAnsi="Arial"/>
+                <w:b w:val="false"/>
+                <w:bCs w:val="false"/>
+                <w:color w:val="1A1A1A"/>
+                <w:sz w:val="13"/>
+                <w:szCs w:val="13"/>
+              </w:rPr>
+              <w:t xml:space="preserve">−56.6%</w:t>
+            </w:r>
+          </w:p>
+        </w:tc>
+      </w:tr>
+      <w:tr>
+        <w:tc>
+          <w:tcPr>
+            <w:tcW w:type="dxa" w:w="1100"/>
+            <w:tcBorders>
+              <w:top w:val="none" w:color="FFFFFF" w:sz="0"/>
+              <w:left w:val="none" w:color="FFFFFF" w:sz="0"/>
+              <w:bottom w:val="single" w:color="D5D9E0" w:sz="4"/>
+              <w:right w:val="none" w:color="FFFFFF" w:sz="0"/>
+            </w:tcBorders>
+            <w:shd w:fill="FDF1CC" w:color="auto" w:val="clear"/>
+            <w:tcMar>
+              <w:top w:type="dxa" w:w="25"/>
+              <w:left w:type="dxa" w:w="80"/>
+              <w:bottom w:type="dxa" w:w="25"/>
+              <w:right w:type="dxa" w:w="80"/>
+            </w:tcMar>
+            <w:vAlign w:val="center"/>
+          </w:tcPr>
+          <w:p>
+            <w:pPr>
+              <w:spacing w:line="216" w:lineRule="auto"/>
+              <w:jc w:val="left"/>
             </w:pPr>
             <w:r>
               <w:rPr>
                 <w:rFonts w:ascii="Arial" w:cs="Arial" w:eastAsia="Arial" w:hAnsi="Arial"/>
                 <w:b/>
                 <w:bCs/>
-                <w:color w:val="FFFFFF"/>
-                <w:sz w:val="13"/>
-                <w:szCs w:val="13"/>
-              </w:rPr>
-              <w:t xml:space="preserve">vs price</w:t>
+                <w:color w:val="1A1A1A"/>
+                <w:sz w:val="13"/>
+                <w:szCs w:val="13"/>
+              </w:rPr>
+              <w:t xml:space="preserve">Base</w:t>
+            </w:r>
+          </w:p>
+        </w:tc>
+        <w:tc>
+          <w:tcPr>
+            <w:tcW w:type="dxa" w:w="6266"/>
+            <w:tcBorders>
+              <w:top w:val="none" w:color="FFFFFF" w:sz="0"/>
+              <w:left w:val="none" w:color="FFFFFF" w:sz="0"/>
+              <w:bottom w:val="single" w:color="D5D9E0" w:sz="4"/>
+              <w:right w:val="none" w:color="FFFFFF" w:sz="0"/>
+            </w:tcBorders>
+            <w:shd w:fill="FDF1CC" w:color="auto" w:val="clear"/>
+            <w:tcMar>
+              <w:top w:type="dxa" w:w="25"/>
+              <w:left w:type="dxa" w:w="80"/>
+              <w:bottom w:type="dxa" w:w="25"/>
+              <w:right w:type="dxa" w:w="80"/>
+            </w:tcMar>
+            <w:vAlign w:val="center"/>
+          </w:tcPr>
+          <w:p>
+            <w:pPr>
+              <w:spacing w:line="216" w:lineRule="auto"/>
+              <w:jc w:val="left"/>
+            </w:pPr>
+            <w:r>
+              <w:rPr>
+                <w:rFonts w:ascii="Arial" w:cs="Arial" w:eastAsia="Arial" w:hAnsi="Arial"/>
+                <w:b/>
+                <w:bCs/>
+                <w:color w:val="1A1A1A"/>
+                <w:sz w:val="13"/>
+                <w:szCs w:val="13"/>
+              </w:rPr>
+              <w:t xml:space="preserve">Central: model v4; nominal WACC 10.54% → 10.41%; g 3.0%; margin 79.7%</w:t>
+            </w:r>
+          </w:p>
+        </w:tc>
+        <w:tc>
+          <w:tcPr>
+            <w:tcW w:type="dxa" w:w="1100"/>
+            <w:tcBorders>
+              <w:top w:val="none" w:color="FFFFFF" w:sz="0"/>
+              <w:left w:val="none" w:color="FFFFFF" w:sz="0"/>
+              <w:bottom w:val="single" w:color="D5D9E0" w:sz="4"/>
+              <w:right w:val="none" w:color="FFFFFF" w:sz="0"/>
+            </w:tcBorders>
+            <w:shd w:fill="FDF1CC" w:color="auto" w:val="clear"/>
+            <w:tcMar>
+              <w:top w:type="dxa" w:w="25"/>
+              <w:left w:type="dxa" w:w="80"/>
+              <w:bottom w:type="dxa" w:w="25"/>
+              <w:right w:type="dxa" w:w="80"/>
+            </w:tcMar>
+            <w:vAlign w:val="center"/>
+          </w:tcPr>
+          <w:p>
+            <w:pPr>
+              <w:spacing w:line="216" w:lineRule="auto"/>
+              <w:jc w:val="right"/>
+            </w:pPr>
+            <w:r>
+              <w:rPr>
+                <w:rFonts w:ascii="Arial" w:cs="Arial" w:eastAsia="Arial" w:hAnsi="Arial"/>
+                <w:b/>
+                <w:bCs/>
+                <w:color w:val="1A1A1A"/>
+                <w:sz w:val="13"/>
+                <w:szCs w:val="13"/>
+              </w:rPr>
+              <w:t xml:space="preserve">1,859</w:t>
+            </w:r>
+          </w:p>
+        </w:tc>
+        <w:tc>
+          <w:tcPr>
+            <w:tcW w:type="dxa" w:w="1200"/>
+            <w:tcBorders>
+              <w:top w:val="none" w:color="FFFFFF" w:sz="0"/>
+              <w:left w:val="none" w:color="FFFFFF" w:sz="0"/>
+              <w:bottom w:val="single" w:color="D5D9E0" w:sz="4"/>
+              <w:right w:val="none" w:color="FFFFFF" w:sz="0"/>
+            </w:tcBorders>
+            <w:shd w:fill="FDF1CC" w:color="auto" w:val="clear"/>
+            <w:tcMar>
+              <w:top w:type="dxa" w:w="25"/>
+              <w:left w:type="dxa" w:w="80"/>
+              <w:bottom w:type="dxa" w:w="25"/>
+              <w:right w:type="dxa" w:w="80"/>
+            </w:tcMar>
+            <w:vAlign w:val="center"/>
+          </w:tcPr>
+          <w:p>
+            <w:pPr>
+              <w:spacing w:line="216" w:lineRule="auto"/>
+              <w:jc w:val="right"/>
+            </w:pPr>
+            <w:r>
+              <w:rPr>
+                <w:rFonts w:ascii="Arial" w:cs="Arial" w:eastAsia="Arial" w:hAnsi="Arial"/>
+                <w:b/>
+                <w:bCs/>
+                <w:color w:val="1A1A1A"/>
+                <w:sz w:val="13"/>
+                <w:szCs w:val="13"/>
+              </w:rPr>
+              <w:t xml:space="preserve">2,077</w:t>
+            </w:r>
+          </w:p>
+        </w:tc>
+        <w:tc>
+          <w:tcPr>
+            <w:tcW w:type="dxa" w:w="1000"/>
+            <w:tcBorders>
+              <w:top w:val="none" w:color="FFFFFF" w:sz="0"/>
+              <w:left w:val="none" w:color="FFFFFF" w:sz="0"/>
+              <w:bottom w:val="single" w:color="D5D9E0" w:sz="4"/>
+              <w:right w:val="none" w:color="FFFFFF" w:sz="0"/>
+            </w:tcBorders>
+            <w:shd w:fill="FDF1CC" w:color="auto" w:val="clear"/>
+            <w:tcMar>
+              <w:top w:type="dxa" w:w="25"/>
+              <w:left w:type="dxa" w:w="80"/>
+              <w:bottom w:type="dxa" w:w="25"/>
+              <w:right w:type="dxa" w:w="80"/>
+            </w:tcMar>
+            <w:vAlign w:val="center"/>
+          </w:tcPr>
+          <w:p>
+            <w:pPr>
+              <w:spacing w:line="216" w:lineRule="auto"/>
+              <w:jc w:val="right"/>
+            </w:pPr>
+            <w:r>
+              <w:rPr>
+                <w:rFonts w:ascii="Arial" w:cs="Arial" w:eastAsia="Arial" w:hAnsi="Arial"/>
+                <w:b/>
+                <w:bCs/>
+                <w:color w:val="1A1A1A"/>
+                <w:sz w:val="13"/>
+                <w:szCs w:val="13"/>
+              </w:rPr>
+              <w:t xml:space="preserve">−41.6%</w:t>
             </w:r>
           </w:p>
         </w:tc>
@@ -28238,13 +28567,13 @@
                 <w:sz w:val="13"/>
                 <w:szCs w:val="13"/>
               </w:rPr>
-              <w:t xml:space="preserve">Bear</w:t>
-            </w:r>
-          </w:p>
-        </w:tc>
-        <w:tc>
-          <w:tcPr>
-            <w:tcW w:type="dxa" w:w="5666"/>
+              <w:t xml:space="preserve">Bull</w:t>
+            </w:r>
+          </w:p>
+        </w:tc>
+        <w:tc>
+          <w:tcPr>
+            <w:tcW w:type="dxa" w:w="6266"/>
             <w:tcBorders>
               <w:top w:val="none" w:color="FFFFFF" w:sz="0"/>
               <w:left w:val="none" w:color="FFFFFF" w:sz="0"/>
@@ -28274,13 +28603,13 @@
                 <w:sz w:val="13"/>
                 <w:szCs w:val="13"/>
               </w:rPr>
-              <w:t xml:space="preserve">Everything goes wrong: nominal WACC +100 bp in all periods; EBITDA margin 75.8%, occupancy 95.1%, same-store rent 2027–28 3.7%, tenant sales 3.7%, 2029–31 real growth at the Note 11 floor, visitors 5.6%, maintenance capex 6.6%</w:t>
-            </w:r>
-          </w:p>
-        </w:tc>
-        <w:tc>
-          <w:tcPr>
-            <w:tcW w:type="dxa" w:w="600"/>
+              <w:t xml:space="preserve">Everything goes right: nominal WACC −100 bp; margin 81.3%, occupancy 96.6%, same-store rent 9.4%, tenant sales 9.9%, real growth at the Note 11 ceiling, visitors 17.3%, maintenance capex 4.8%; cash tax capped at 23%</w:t>
+            </w:r>
+          </w:p>
+        </w:tc>
+        <w:tc>
+          <w:tcPr>
+            <w:tcW w:type="dxa" w:w="1100"/>
             <w:tcBorders>
               <w:top w:val="none" w:color="FFFFFF" w:sz="0"/>
               <w:left w:val="none" w:color="FFFFFF" w:sz="0"/>
@@ -28310,13 +28639,13 @@
                 <w:sz w:val="13"/>
                 <w:szCs w:val="13"/>
               </w:rPr>
-              <w:t xml:space="preserve">25%</w:t>
-            </w:r>
-          </w:p>
-        </w:tc>
-        <w:tc>
-          <w:tcPr>
-            <w:tcW w:type="dxa" w:w="1100"/>
+              <w:t xml:space="preserve">2,906</w:t>
+            </w:r>
+          </w:p>
+        </w:tc>
+        <w:tc>
+          <w:tcPr>
+            <w:tcW w:type="dxa" w:w="1200"/>
             <w:tcBorders>
               <w:top w:val="none" w:color="FFFFFF" w:sz="0"/>
               <w:left w:val="none" w:color="FFFFFF" w:sz="0"/>
@@ -28346,13 +28675,13 @@
                 <w:sz w:val="13"/>
                 <w:szCs w:val="13"/>
               </w:rPr>
-              <w:t xml:space="preserve">1,190</w:t>
-            </w:r>
-          </w:p>
-        </w:tc>
-        <w:tc>
-          <w:tcPr>
-            <w:tcW w:type="dxa" w:w="1200"/>
+              <w:t xml:space="preserve">2,915</w:t>
+            </w:r>
+          </w:p>
+        </w:tc>
+        <w:tc>
+          <w:tcPr>
+            <w:tcW w:type="dxa" w:w="1000"/>
             <w:tcBorders>
               <w:top w:val="none" w:color="FFFFFF" w:sz="0"/>
               <w:left w:val="none" w:color="FFFFFF" w:sz="0"/>
@@ -28382,43 +28711,7 @@
                 <w:sz w:val="13"/>
                 <w:szCs w:val="13"/>
               </w:rPr>
-              <w:t xml:space="preserve">1,542</w:t>
-            </w:r>
-          </w:p>
-        </w:tc>
-        <w:tc>
-          <w:tcPr>
-            <w:tcW w:type="dxa" w:w="1000"/>
-            <w:tcBorders>
-              <w:top w:val="none" w:color="FFFFFF" w:sz="0"/>
-              <w:left w:val="none" w:color="FFFFFF" w:sz="0"/>
-              <w:bottom w:val="single" w:color="D5D9E0" w:sz="4"/>
-              <w:right w:val="none" w:color="FFFFFF" w:sz="0"/>
-            </w:tcBorders>
-            <w:shd w:fill="F7F8FB" w:color="auto" w:val="clear"/>
-            <w:tcMar>
-              <w:top w:type="dxa" w:w="25"/>
-              <w:left w:type="dxa" w:w="80"/>
-              <w:bottom w:type="dxa" w:w="25"/>
-              <w:right w:type="dxa" w:w="80"/>
-            </w:tcMar>
-            <w:vAlign w:val="center"/>
-          </w:tcPr>
-          <w:p>
-            <w:pPr>
-              <w:spacing w:line="216" w:lineRule="auto"/>
-              <w:jc w:val="right"/>
-            </w:pPr>
-            <w:r>
-              <w:rPr>
-                <w:rFonts w:ascii="Arial" w:cs="Arial" w:eastAsia="Arial" w:hAnsi="Arial"/>
-                <w:b w:val="false"/>
-                <w:bCs w:val="false"/>
-                <w:color w:val="1A1A1A"/>
-                <w:sz w:val="13"/>
-                <w:szCs w:val="13"/>
-              </w:rPr>
-              <w:t xml:space="preserve">−56.6%</w:t>
+              <w:t xml:space="preserve">−18.0%</w:t>
             </w:r>
           </w:p>
         </w:tc>
@@ -28433,7 +28726,7 @@
               <w:bottom w:val="single" w:color="D5D9E0" w:sz="4"/>
               <w:right w:val="none" w:color="FFFFFF" w:sz="0"/>
             </w:tcBorders>
-            <w:shd w:fill="FDF1CC" w:color="auto" w:val="clear"/>
+            <w:shd w:fill="FFFFFF" w:color="auto" w:val="clear"/>
             <w:tcMar>
               <w:top w:type="dxa" w:w="25"/>
               <w:left w:type="dxa" w:w="80"/>
@@ -28446,856 +28739,1071 @@
             <w:pPr>
               <w:spacing w:line="216" w:lineRule="auto"/>
               <w:jc w:val="left"/>
+            </w:pPr>
+            <w:r>
+              <w:rPr>
+                <w:rFonts w:ascii="Arial" w:cs="Arial" w:eastAsia="Arial" w:hAnsi="Arial"/>
+                <w:b w:val="false"/>
+                <w:bCs w:val="false"/>
+                <w:color w:val="1A1A1A"/>
+                <w:sz w:val="13"/>
+                <w:szCs w:val="13"/>
+              </w:rPr>
+              <w:t xml:space="preserve">Appraisers</w:t>
+            </w:r>
+          </w:p>
+        </w:tc>
+        <w:tc>
+          <w:tcPr>
+            <w:tcW w:type="dxa" w:w="6266"/>
+            <w:tcBorders>
+              <w:top w:val="none" w:color="FFFFFF" w:sz="0"/>
+              <w:left w:val="none" w:color="FFFFFF" w:sz="0"/>
+              <w:bottom w:val="single" w:color="D5D9E0" w:sz="4"/>
+              <w:right w:val="none" w:color="FFFFFF" w:sz="0"/>
+            </w:tcBorders>
+            <w:shd w:fill="FFFFFF" w:color="auto" w:val="clear"/>
+            <w:tcMar>
+              <w:top w:type="dxa" w:w="25"/>
+              <w:left w:type="dxa" w:w="80"/>
+              <w:bottom w:type="dxa" w:w="25"/>
+              <w:right w:type="dxa" w:w="80"/>
+            </w:tcMar>
+            <w:vAlign w:val="center"/>
+          </w:tcPr>
+          <w:p>
+            <w:pPr>
+              <w:spacing w:line="216" w:lineRule="auto"/>
+              <w:jc w:val="left"/>
+            </w:pPr>
+            <w:r>
+              <w:rPr>
+                <w:rFonts w:ascii="Arial" w:cs="Arial" w:eastAsia="Arial" w:hAnsi="Arial"/>
+                <w:b w:val="false"/>
+                <w:bCs w:val="false"/>
+                <w:color w:val="1A1A1A"/>
+                <w:sz w:val="13"/>
+                <w:szCs w:val="13"/>
+              </w:rPr>
+              <w:t xml:space="preserve">Nominal WACC 8.72% (5.55% real, Note 11) in all periods</w:t>
+            </w:r>
+          </w:p>
+        </w:tc>
+        <w:tc>
+          <w:tcPr>
+            <w:tcW w:type="dxa" w:w="1100"/>
+            <w:tcBorders>
+              <w:top w:val="none" w:color="FFFFFF" w:sz="0"/>
+              <w:left w:val="none" w:color="FFFFFF" w:sz="0"/>
+              <w:bottom w:val="single" w:color="D5D9E0" w:sz="4"/>
+              <w:right w:val="none" w:color="FFFFFF" w:sz="0"/>
+            </w:tcBorders>
+            <w:shd w:fill="FFFFFF" w:color="auto" w:val="clear"/>
+            <w:tcMar>
+              <w:top w:type="dxa" w:w="25"/>
+              <w:left w:type="dxa" w:w="80"/>
+              <w:bottom w:type="dxa" w:w="25"/>
+              <w:right w:type="dxa" w:w="80"/>
+            </w:tcMar>
+            <w:vAlign w:val="center"/>
+          </w:tcPr>
+          <w:p>
+            <w:pPr>
+              <w:spacing w:line="216" w:lineRule="auto"/>
+              <w:jc w:val="right"/>
+            </w:pPr>
+            <w:r>
+              <w:rPr>
+                <w:rFonts w:ascii="Arial" w:cs="Arial" w:eastAsia="Arial" w:hAnsi="Arial"/>
+                <w:b w:val="false"/>
+                <w:bCs w:val="false"/>
+                <w:color w:val="1A1A1A"/>
+                <w:sz w:val="13"/>
+                <w:szCs w:val="13"/>
+              </w:rPr>
+              <w:t xml:space="preserve">2,679</w:t>
+            </w:r>
+          </w:p>
+        </w:tc>
+        <w:tc>
+          <w:tcPr>
+            <w:tcW w:type="dxa" w:w="1200"/>
+            <w:tcBorders>
+              <w:top w:val="none" w:color="FFFFFF" w:sz="0"/>
+              <w:left w:val="none" w:color="FFFFFF" w:sz="0"/>
+              <w:bottom w:val="single" w:color="D5D9E0" w:sz="4"/>
+              <w:right w:val="none" w:color="FFFFFF" w:sz="0"/>
+            </w:tcBorders>
+            <w:shd w:fill="FFFFFF" w:color="auto" w:val="clear"/>
+            <w:tcMar>
+              <w:top w:type="dxa" w:w="25"/>
+              <w:left w:type="dxa" w:w="80"/>
+              <w:bottom w:type="dxa" w:w="25"/>
+              <w:right w:type="dxa" w:w="80"/>
+            </w:tcMar>
+            <w:vAlign w:val="center"/>
+          </w:tcPr>
+          <w:p>
+            <w:pPr>
+              <w:spacing w:line="216" w:lineRule="auto"/>
+              <w:jc w:val="right"/>
+            </w:pPr>
+            <w:r>
+              <w:rPr>
+                <w:rFonts w:ascii="Arial" w:cs="Arial" w:eastAsia="Arial" w:hAnsi="Arial"/>
+                <w:b w:val="false"/>
+                <w:bCs w:val="false"/>
+                <w:color w:val="1A1A1A"/>
+                <w:sz w:val="13"/>
+                <w:szCs w:val="13"/>
+              </w:rPr>
+              <w:t xml:space="preserve">2,734</w:t>
+            </w:r>
+          </w:p>
+        </w:tc>
+        <w:tc>
+          <w:tcPr>
+            <w:tcW w:type="dxa" w:w="1000"/>
+            <w:tcBorders>
+              <w:top w:val="none" w:color="FFFFFF" w:sz="0"/>
+              <w:left w:val="none" w:color="FFFFFF" w:sz="0"/>
+              <w:bottom w:val="single" w:color="D5D9E0" w:sz="4"/>
+              <w:right w:val="none" w:color="FFFFFF" w:sz="0"/>
+            </w:tcBorders>
+            <w:shd w:fill="FFFFFF" w:color="auto" w:val="clear"/>
+            <w:tcMar>
+              <w:top w:type="dxa" w:w="25"/>
+              <w:left w:type="dxa" w:w="80"/>
+              <w:bottom w:type="dxa" w:w="25"/>
+              <w:right w:type="dxa" w:w="80"/>
+            </w:tcMar>
+            <w:vAlign w:val="center"/>
+          </w:tcPr>
+          <w:p>
+            <w:pPr>
+              <w:spacing w:line="216" w:lineRule="auto"/>
+              <w:jc w:val="right"/>
+            </w:pPr>
+            <w:r>
+              <w:rPr>
+                <w:rFonts w:ascii="Arial" w:cs="Arial" w:eastAsia="Arial" w:hAnsi="Arial"/>
+                <w:b w:val="false"/>
+                <w:bCs w:val="false"/>
+                <w:color w:val="1A1A1A"/>
+                <w:sz w:val="13"/>
+                <w:szCs w:val="13"/>
+              </w:rPr>
+              <w:t xml:space="preserve">−23.1%</w:t>
+            </w:r>
+          </w:p>
+        </w:tc>
+      </w:tr>
+    </w:tbl>
+    <w:p>
+      <w:pPr>
+        <w:spacing w:after="0" w:before="10" w:line="216" w:lineRule="auto"/>
+      </w:pPr>
+      <w:r>
+        <w:rPr>
+          <w:rFonts w:ascii="Arial" w:cs="Arial" w:eastAsia="Arial" w:hAnsi="Arial"/>
+          <w:color w:val="5F5F5F"/>
+          <w:sz w:val="11"/>
+          <w:szCs w:val="11"/>
+        </w:rPr>
+        <w:t xml:space="preserve">Bear and bull are illustrative extreme scenarios with no probability assigned: the probability of outcomes is estimated with the simulation in the next section. Source: Team analysis.</w:t>
+      </w:r>
+    </w:p>
+    <w:p>
+      <w:pPr>
+        <w:pBdr>
+          <w:bottom w:val="single" w:color="E9004B" w:sz="8" w:space="1"/>
+        </w:pBdr>
+        <w:spacing w:after="50" w:before="120"/>
+      </w:pPr>
+      <w:r>
+        <w:rPr>
+          <w:rFonts w:ascii="Arial" w:cs="Arial" w:eastAsia="Arial" w:hAnsi="Arial"/>
+          <w:b/>
+          <w:bCs/>
+          <w:color w:val="14284B"/>
+          <w:sz w:val="16"/>
+          <w:szCs w:val="16"/>
+        </w:rPr>
+        <w:t xml:space="preserve">MONTE CARLO SIMULATION: TARGET PRICE DISTRIBUTION</w:t>
+      </w:r>
+    </w:p>
+    <w:tbl>
+      <w:tblPr>
+        <w:tblW w:type="dxa" w:w="10666"/>
+        <w:tblBorders>
+          <w:top w:val="none" w:color="FFFFFF" w:sz="0"/>
+          <w:left w:val="none" w:color="FFFFFF" w:sz="0"/>
+          <w:bottom w:val="none" w:color="FFFFFF" w:sz="0"/>
+          <w:right w:val="none" w:color="FFFFFF" w:sz="0"/>
+          <w:insideH w:val="none" w:color="FFFFFF" w:sz="0"/>
+          <w:insideV w:val="none" w:color="FFFFFF" w:sz="0"/>
+        </w:tblBorders>
+      </w:tblPr>
+      <w:tblGrid>
+        <w:gridCol w:w="5225"/>
+        <w:gridCol w:w="216"/>
+        <w:gridCol w:w="5225"/>
+      </w:tblGrid>
+      <w:tr>
+        <w:trPr>
+          <w:cantSplit/>
+        </w:trPr>
+        <w:tc>
+          <w:tcPr>
+            <w:tcW w:type="dxa" w:w="5225"/>
+            <w:tcBorders>
+              <w:top w:val="none" w:color="FFFFFF" w:sz="0"/>
+              <w:left w:val="none" w:color="FFFFFF" w:sz="0"/>
+              <w:bottom w:val="none" w:color="FFFFFF" w:sz="0"/>
+              <w:right w:val="none" w:color="FFFFFF" w:sz="0"/>
+            </w:tcBorders>
+            <w:tcMar>
+              <w:top w:type="dxa" w:w="0"/>
+              <w:left w:type="dxa" w:w="0"/>
+              <w:bottom w:type="dxa" w:w="0"/>
+              <w:right w:type="dxa" w:w="0"/>
+            </w:tcMar>
+            <w:vAlign w:val="top"/>
+          </w:tcPr>
+          <w:tbl>
+            <w:tblPr>
+              <w:tblW w:type="dxa" w:w="4900"/>
+              <w:tblBorders>
+                <w:top w:val="none" w:color="FFFFFF" w:sz="0"/>
+                <w:left w:val="none" w:color="FFFFFF" w:sz="0"/>
+                <w:bottom w:val="none" w:color="FFFFFF" w:sz="0"/>
+                <w:right w:val="none" w:color="FFFFFF" w:sz="0"/>
+                <w:insideH w:val="none" w:color="FFFFFF" w:sz="0"/>
+                <w:insideV w:val="none" w:color="FFFFFF" w:sz="0"/>
+              </w:tblBorders>
+            </w:tblPr>
+            <w:tblGrid>
+              <w:gridCol w:w="3400"/>
+              <w:gridCol w:w="1500"/>
+            </w:tblGrid>
+            <w:tr>
+              <w:trPr>
+                <w:tblHeader/>
+              </w:trPr>
+              <w:tc>
+                <w:tcPr>
+                  <w:tcW w:type="dxa" w:w="3400"/>
+                  <w:tcBorders>
+                    <w:top w:val="none" w:color="FFFFFF" w:sz="0"/>
+                    <w:left w:val="none" w:color="FFFFFF" w:sz="0"/>
+                    <w:bottom w:val="none" w:color="FFFFFF" w:sz="0"/>
+                    <w:right w:val="none" w:color="FFFFFF" w:sz="0"/>
+                  </w:tcBorders>
+                  <w:shd w:fill="14284B" w:color="auto" w:val="clear"/>
+                  <w:tcMar>
+                    <w:top w:type="dxa" w:w="35"/>
+                    <w:left w:type="dxa" w:w="80"/>
+                    <w:bottom w:type="dxa" w:w="35"/>
+                    <w:right w:type="dxa" w:w="80"/>
+                  </w:tcMar>
+                </w:tcPr>
+                <w:p>
+                  <w:pPr>
+                    <w:jc w:val="left"/>
+                  </w:pPr>
+                  <w:r>
+                    <w:rPr>
+                      <w:rFonts w:ascii="Arial" w:cs="Arial" w:eastAsia="Arial" w:hAnsi="Arial"/>
+                      <w:b/>
+                      <w:bCs/>
+                      <w:color w:val="FFFFFF"/>
+                      <w:sz w:val="13"/>
+                      <w:szCs w:val="13"/>
+                    </w:rPr>
+                    <w:t xml:space="preserve">Simulated target price (CLP)</w:t>
+                  </w:r>
+                </w:p>
+              </w:tc>
+              <w:tc>
+                <w:tcPr>
+                  <w:tcW w:type="dxa" w:w="1500"/>
+                  <w:tcBorders>
+                    <w:top w:val="none" w:color="FFFFFF" w:sz="0"/>
+                    <w:left w:val="none" w:color="FFFFFF" w:sz="0"/>
+                    <w:bottom w:val="none" w:color="FFFFFF" w:sz="0"/>
+                    <w:right w:val="none" w:color="FFFFFF" w:sz="0"/>
+                  </w:tcBorders>
+                  <w:shd w:fill="14284B" w:color="auto" w:val="clear"/>
+                  <w:tcMar>
+                    <w:top w:type="dxa" w:w="35"/>
+                    <w:left w:type="dxa" w:w="80"/>
+                    <w:bottom w:type="dxa" w:w="35"/>
+                    <w:right w:type="dxa" w:w="80"/>
+                  </w:tcMar>
+                </w:tcPr>
+                <w:p>
+                  <w:pPr>
+                    <w:jc w:val="right"/>
+                  </w:pPr>
+                  <w:r>
+                    <w:rPr>
+                      <w:rFonts w:ascii="Arial" w:cs="Arial" w:eastAsia="Arial" w:hAnsi="Arial"/>
+                      <w:b/>
+                      <w:bCs/>
+                      <w:color w:val="FFFFFF"/>
+                      <w:sz w:val="13"/>
+                      <w:szCs w:val="13"/>
+                    </w:rPr>
+                    <w:t xml:space="preserve">Value</w:t>
+                  </w:r>
+                </w:p>
+              </w:tc>
+            </w:tr>
+            <w:tr>
+              <w:tc>
+                <w:tcPr>
+                  <w:tcW w:type="dxa" w:w="3400"/>
+                  <w:tcBorders>
+                    <w:top w:val="none" w:color="FFFFFF" w:sz="0"/>
+                    <w:left w:val="none" w:color="FFFFFF" w:sz="0"/>
+                    <w:bottom w:val="single" w:color="D5D9E0" w:sz="4"/>
+                    <w:right w:val="none" w:color="FFFFFF" w:sz="0"/>
+                  </w:tcBorders>
+                  <w:shd w:fill="F7F8FB" w:color="auto" w:val="clear"/>
+                  <w:tcMar>
+                    <w:top w:type="dxa" w:w="25"/>
+                    <w:left w:type="dxa" w:w="80"/>
+                    <w:bottom w:type="dxa" w:w="25"/>
+                    <w:right w:type="dxa" w:w="80"/>
+                  </w:tcMar>
+                  <w:vAlign w:val="center"/>
+                </w:tcPr>
+                <w:p>
+                  <w:pPr>
+                    <w:spacing w:line="216" w:lineRule="auto"/>
+                    <w:jc w:val="left"/>
+                  </w:pPr>
+                  <w:r>
+                    <w:rPr>
+                      <w:rFonts w:ascii="Arial" w:cs="Arial" w:eastAsia="Arial" w:hAnsi="Arial"/>
+                      <w:b w:val="false"/>
+                      <w:bCs w:val="false"/>
+                      <w:color w:val="1A1A1A"/>
+                      <w:sz w:val="13"/>
+                      <w:szCs w:val="13"/>
+                    </w:rPr>
+                    <w:t xml:space="preserve">Mean</w:t>
+                  </w:r>
+                </w:p>
+              </w:tc>
+              <w:tc>
+                <w:tcPr>
+                  <w:tcW w:type="dxa" w:w="1500"/>
+                  <w:tcBorders>
+                    <w:top w:val="none" w:color="FFFFFF" w:sz="0"/>
+                    <w:left w:val="none" w:color="FFFFFF" w:sz="0"/>
+                    <w:bottom w:val="single" w:color="D5D9E0" w:sz="4"/>
+                    <w:right w:val="none" w:color="FFFFFF" w:sz="0"/>
+                  </w:tcBorders>
+                  <w:shd w:fill="F7F8FB" w:color="auto" w:val="clear"/>
+                  <w:tcMar>
+                    <w:top w:type="dxa" w:w="25"/>
+                    <w:left w:type="dxa" w:w="80"/>
+                    <w:bottom w:type="dxa" w:w="25"/>
+                    <w:right w:type="dxa" w:w="80"/>
+                  </w:tcMar>
+                  <w:vAlign w:val="center"/>
+                </w:tcPr>
+                <w:p>
+                  <w:pPr>
+                    <w:spacing w:line="216" w:lineRule="auto"/>
+                    <w:jc w:val="right"/>
+                  </w:pPr>
+                  <w:r>
+                    <w:rPr>
+                      <w:rFonts w:ascii="Arial" w:cs="Arial" w:eastAsia="Arial" w:hAnsi="Arial"/>
+                      <w:b w:val="false"/>
+                      <w:bCs w:val="false"/>
+                      <w:color w:val="1A1A1A"/>
+                      <w:sz w:val="13"/>
+                      <w:szCs w:val="13"/>
+                    </w:rPr>
+                    <w:t xml:space="preserve">2,057</w:t>
+                  </w:r>
+                </w:p>
+              </w:tc>
+            </w:tr>
+            <w:tr>
+              <w:tc>
+                <w:tcPr>
+                  <w:tcW w:type="dxa" w:w="3400"/>
+                  <w:tcBorders>
+                    <w:top w:val="none" w:color="FFFFFF" w:sz="0"/>
+                    <w:left w:val="none" w:color="FFFFFF" w:sz="0"/>
+                    <w:bottom w:val="single" w:color="D5D9E0" w:sz="4"/>
+                    <w:right w:val="none" w:color="FFFFFF" w:sz="0"/>
+                  </w:tcBorders>
+                  <w:shd w:fill="FFFFFF" w:color="auto" w:val="clear"/>
+                  <w:tcMar>
+                    <w:top w:type="dxa" w:w="25"/>
+                    <w:left w:type="dxa" w:w="80"/>
+                    <w:bottom w:type="dxa" w:w="25"/>
+                    <w:right w:type="dxa" w:w="80"/>
+                  </w:tcMar>
+                  <w:vAlign w:val="center"/>
+                </w:tcPr>
+                <w:p>
+                  <w:pPr>
+                    <w:spacing w:line="216" w:lineRule="auto"/>
+                    <w:jc w:val="left"/>
+                  </w:pPr>
+                  <w:r>
+                    <w:rPr>
+                      <w:rFonts w:ascii="Arial" w:cs="Arial" w:eastAsia="Arial" w:hAnsi="Arial"/>
+                      <w:b w:val="false"/>
+                      <w:bCs w:val="false"/>
+                      <w:color w:val="1A1A1A"/>
+                      <w:sz w:val="13"/>
+                      <w:szCs w:val="13"/>
+                    </w:rPr>
+                    <w:t xml:space="preserve">Median</w:t>
+                  </w:r>
+                </w:p>
+              </w:tc>
+              <w:tc>
+                <w:tcPr>
+                  <w:tcW w:type="dxa" w:w="1500"/>
+                  <w:tcBorders>
+                    <w:top w:val="none" w:color="FFFFFF" w:sz="0"/>
+                    <w:left w:val="none" w:color="FFFFFF" w:sz="0"/>
+                    <w:bottom w:val="single" w:color="D5D9E0" w:sz="4"/>
+                    <w:right w:val="none" w:color="FFFFFF" w:sz="0"/>
+                  </w:tcBorders>
+                  <w:shd w:fill="FFFFFF" w:color="auto" w:val="clear"/>
+                  <w:tcMar>
+                    <w:top w:type="dxa" w:w="25"/>
+                    <w:left w:type="dxa" w:w="80"/>
+                    <w:bottom w:type="dxa" w:w="25"/>
+                    <w:right w:type="dxa" w:w="80"/>
+                  </w:tcMar>
+                  <w:vAlign w:val="center"/>
+                </w:tcPr>
+                <w:p>
+                  <w:pPr>
+                    <w:spacing w:line="216" w:lineRule="auto"/>
+                    <w:jc w:val="right"/>
+                  </w:pPr>
+                  <w:r>
+                    <w:rPr>
+                      <w:rFonts w:ascii="Arial" w:cs="Arial" w:eastAsia="Arial" w:hAnsi="Arial"/>
+                      <w:b w:val="false"/>
+                      <w:bCs w:val="false"/>
+                      <w:color w:val="1A1A1A"/>
+                      <w:sz w:val="13"/>
+                      <w:szCs w:val="13"/>
+                    </w:rPr>
+                    <w:t xml:space="preserve">2,047</w:t>
+                  </w:r>
+                </w:p>
+              </w:tc>
+            </w:tr>
+            <w:tr>
+              <w:tc>
+                <w:tcPr>
+                  <w:tcW w:type="dxa" w:w="3400"/>
+                  <w:tcBorders>
+                    <w:top w:val="none" w:color="FFFFFF" w:sz="0"/>
+                    <w:left w:val="none" w:color="FFFFFF" w:sz="0"/>
+                    <w:bottom w:val="single" w:color="D5D9E0" w:sz="4"/>
+                    <w:right w:val="none" w:color="FFFFFF" w:sz="0"/>
+                  </w:tcBorders>
+                  <w:shd w:fill="F7F8FB" w:color="auto" w:val="clear"/>
+                  <w:tcMar>
+                    <w:top w:type="dxa" w:w="25"/>
+                    <w:left w:type="dxa" w:w="80"/>
+                    <w:bottom w:type="dxa" w:w="25"/>
+                    <w:right w:type="dxa" w:w="80"/>
+                  </w:tcMar>
+                  <w:vAlign w:val="center"/>
+                </w:tcPr>
+                <w:p>
+                  <w:pPr>
+                    <w:spacing w:line="216" w:lineRule="auto"/>
+                    <w:jc w:val="left"/>
+                  </w:pPr>
+                  <w:r>
+                    <w:rPr>
+                      <w:rFonts w:ascii="Arial" w:cs="Arial" w:eastAsia="Arial" w:hAnsi="Arial"/>
+                      <w:b w:val="false"/>
+                      <w:bCs w:val="false"/>
+                      <w:color w:val="1A1A1A"/>
+                      <w:sz w:val="13"/>
+                      <w:szCs w:val="13"/>
+                    </w:rPr>
+                    <w:t xml:space="preserve">Standard deviation</w:t>
+                  </w:r>
+                </w:p>
+              </w:tc>
+              <w:tc>
+                <w:tcPr>
+                  <w:tcW w:type="dxa" w:w="1500"/>
+                  <w:tcBorders>
+                    <w:top w:val="none" w:color="FFFFFF" w:sz="0"/>
+                    <w:left w:val="none" w:color="FFFFFF" w:sz="0"/>
+                    <w:bottom w:val="single" w:color="D5D9E0" w:sz="4"/>
+                    <w:right w:val="none" w:color="FFFFFF" w:sz="0"/>
+                  </w:tcBorders>
+                  <w:shd w:fill="F7F8FB" w:color="auto" w:val="clear"/>
+                  <w:tcMar>
+                    <w:top w:type="dxa" w:w="25"/>
+                    <w:left w:type="dxa" w:w="80"/>
+                    <w:bottom w:type="dxa" w:w="25"/>
+                    <w:right w:type="dxa" w:w="80"/>
+                  </w:tcMar>
+                  <w:vAlign w:val="center"/>
+                </w:tcPr>
+                <w:p>
+                  <w:pPr>
+                    <w:spacing w:line="216" w:lineRule="auto"/>
+                    <w:jc w:val="right"/>
+                  </w:pPr>
+                  <w:r>
+                    <w:rPr>
+                      <w:rFonts w:ascii="Arial" w:cs="Arial" w:eastAsia="Arial" w:hAnsi="Arial"/>
+                      <w:b w:val="false"/>
+                      <w:bCs w:val="false"/>
+                      <w:color w:val="1A1A1A"/>
+                      <w:sz w:val="13"/>
+                      <w:szCs w:val="13"/>
+                    </w:rPr>
+                    <w:t xml:space="preserve">168</w:t>
+                  </w:r>
+                </w:p>
+              </w:tc>
+            </w:tr>
+            <w:tr>
+              <w:tc>
+                <w:tcPr>
+                  <w:tcW w:type="dxa" w:w="3400"/>
+                  <w:tcBorders>
+                    <w:top w:val="none" w:color="FFFFFF" w:sz="0"/>
+                    <w:left w:val="none" w:color="FFFFFF" w:sz="0"/>
+                    <w:bottom w:val="single" w:color="D5D9E0" w:sz="4"/>
+                    <w:right w:val="none" w:color="FFFFFF" w:sz="0"/>
+                  </w:tcBorders>
+                  <w:shd w:fill="FFFFFF" w:color="auto" w:val="clear"/>
+                  <w:tcMar>
+                    <w:top w:type="dxa" w:w="25"/>
+                    <w:left w:type="dxa" w:w="80"/>
+                    <w:bottom w:type="dxa" w:w="25"/>
+                    <w:right w:type="dxa" w:w="80"/>
+                  </w:tcMar>
+                  <w:vAlign w:val="center"/>
+                </w:tcPr>
+                <w:p>
+                  <w:pPr>
+                    <w:spacing w:line="216" w:lineRule="auto"/>
+                    <w:jc w:val="left"/>
+                  </w:pPr>
+                  <w:r>
+                    <w:rPr>
+                      <w:rFonts w:ascii="Arial" w:cs="Arial" w:eastAsia="Arial" w:hAnsi="Arial"/>
+                      <w:b w:val="false"/>
+                      <w:bCs w:val="false"/>
+                      <w:color w:val="1A1A1A"/>
+                      <w:sz w:val="13"/>
+                      <w:szCs w:val="13"/>
+                    </w:rPr>
+                    <w:t xml:space="preserve">P5 / P25</w:t>
+                  </w:r>
+                </w:p>
+              </w:tc>
+              <w:tc>
+                <w:tcPr>
+                  <w:tcW w:type="dxa" w:w="1500"/>
+                  <w:tcBorders>
+                    <w:top w:val="none" w:color="FFFFFF" w:sz="0"/>
+                    <w:left w:val="none" w:color="FFFFFF" w:sz="0"/>
+                    <w:bottom w:val="single" w:color="D5D9E0" w:sz="4"/>
+                    <w:right w:val="none" w:color="FFFFFF" w:sz="0"/>
+                  </w:tcBorders>
+                  <w:shd w:fill="FFFFFF" w:color="auto" w:val="clear"/>
+                  <w:tcMar>
+                    <w:top w:type="dxa" w:w="25"/>
+                    <w:left w:type="dxa" w:w="80"/>
+                    <w:bottom w:type="dxa" w:w="25"/>
+                    <w:right w:type="dxa" w:w="80"/>
+                  </w:tcMar>
+                  <w:vAlign w:val="center"/>
+                </w:tcPr>
+                <w:p>
+                  <w:pPr>
+                    <w:spacing w:line="216" w:lineRule="auto"/>
+                    <w:jc w:val="right"/>
+                  </w:pPr>
+                  <w:r>
+                    <w:rPr>
+                      <w:rFonts w:ascii="Arial" w:cs="Arial" w:eastAsia="Arial" w:hAnsi="Arial"/>
+                      <w:b w:val="false"/>
+                      <w:bCs w:val="false"/>
+                      <w:color w:val="1A1A1A"/>
+                      <w:sz w:val="13"/>
+                      <w:szCs w:val="13"/>
+                    </w:rPr>
+                    <w:t xml:space="preserve">1,799 / 1,940</w:t>
+                  </w:r>
+                </w:p>
+              </w:tc>
+            </w:tr>
+            <w:tr>
+              <w:tc>
+                <w:tcPr>
+                  <w:tcW w:type="dxa" w:w="3400"/>
+                  <w:tcBorders>
+                    <w:top w:val="none" w:color="FFFFFF" w:sz="0"/>
+                    <w:left w:val="none" w:color="FFFFFF" w:sz="0"/>
+                    <w:bottom w:val="single" w:color="D5D9E0" w:sz="4"/>
+                    <w:right w:val="none" w:color="FFFFFF" w:sz="0"/>
+                  </w:tcBorders>
+                  <w:shd w:fill="F7F8FB" w:color="auto" w:val="clear"/>
+                  <w:tcMar>
+                    <w:top w:type="dxa" w:w="25"/>
+                    <w:left w:type="dxa" w:w="80"/>
+                    <w:bottom w:type="dxa" w:w="25"/>
+                    <w:right w:type="dxa" w:w="80"/>
+                  </w:tcMar>
+                  <w:vAlign w:val="center"/>
+                </w:tcPr>
+                <w:p>
+                  <w:pPr>
+                    <w:spacing w:line="216" w:lineRule="auto"/>
+                    <w:jc w:val="left"/>
+                  </w:pPr>
+                  <w:r>
+                    <w:rPr>
+                      <w:rFonts w:ascii="Arial" w:cs="Arial" w:eastAsia="Arial" w:hAnsi="Arial"/>
+                      <w:b w:val="false"/>
+                      <w:bCs w:val="false"/>
+                      <w:color w:val="1A1A1A"/>
+                      <w:sz w:val="13"/>
+                      <w:szCs w:val="13"/>
+                    </w:rPr>
+                    <w:t xml:space="preserve">P75 / P95</w:t>
+                  </w:r>
+                </w:p>
+              </w:tc>
+              <w:tc>
+                <w:tcPr>
+                  <w:tcW w:type="dxa" w:w="1500"/>
+                  <w:tcBorders>
+                    <w:top w:val="none" w:color="FFFFFF" w:sz="0"/>
+                    <w:left w:val="none" w:color="FFFFFF" w:sz="0"/>
+                    <w:bottom w:val="single" w:color="D5D9E0" w:sz="4"/>
+                    <w:right w:val="none" w:color="FFFFFF" w:sz="0"/>
+                  </w:tcBorders>
+                  <w:shd w:fill="F7F8FB" w:color="auto" w:val="clear"/>
+                  <w:tcMar>
+                    <w:top w:type="dxa" w:w="25"/>
+                    <w:left w:type="dxa" w:w="80"/>
+                    <w:bottom w:type="dxa" w:w="25"/>
+                    <w:right w:type="dxa" w:w="80"/>
+                  </w:tcMar>
+                  <w:vAlign w:val="center"/>
+                </w:tcPr>
+                <w:p>
+                  <w:pPr>
+                    <w:spacing w:line="216" w:lineRule="auto"/>
+                    <w:jc w:val="right"/>
+                  </w:pPr>
+                  <w:r>
+                    <w:rPr>
+                      <w:rFonts w:ascii="Arial" w:cs="Arial" w:eastAsia="Arial" w:hAnsi="Arial"/>
+                      <w:b w:val="false"/>
+                      <w:bCs w:val="false"/>
+                      <w:color w:val="1A1A1A"/>
+                      <w:sz w:val="13"/>
+                      <w:szCs w:val="13"/>
+                    </w:rPr>
+                    <w:t xml:space="preserve">2,164 / 2,354</w:t>
+                  </w:r>
+                </w:p>
+              </w:tc>
+            </w:tr>
+            <w:tr>
+              <w:tc>
+                <w:tcPr>
+                  <w:tcW w:type="dxa" w:w="3400"/>
+                  <w:tcBorders>
+                    <w:top w:val="none" w:color="FFFFFF" w:sz="0"/>
+                    <w:left w:val="none" w:color="FFFFFF" w:sz="0"/>
+                    <w:bottom w:val="single" w:color="D5D9E0" w:sz="4"/>
+                    <w:right w:val="none" w:color="FFFFFF" w:sz="0"/>
+                  </w:tcBorders>
+                  <w:shd w:fill="FFFFFF" w:color="auto" w:val="clear"/>
+                  <w:tcMar>
+                    <w:top w:type="dxa" w:w="25"/>
+                    <w:left w:type="dxa" w:w="80"/>
+                    <w:bottom w:type="dxa" w:w="25"/>
+                    <w:right w:type="dxa" w:w="80"/>
+                  </w:tcMar>
+                  <w:vAlign w:val="center"/>
+                </w:tcPr>
+                <w:p>
+                  <w:pPr>
+                    <w:spacing w:line="216" w:lineRule="auto"/>
+                    <w:jc w:val="left"/>
+                  </w:pPr>
+                  <w:r>
+                    <w:rPr>
+                      <w:rFonts w:ascii="Arial" w:cs="Arial" w:eastAsia="Arial" w:hAnsi="Arial"/>
+                      <w:b w:val="false"/>
+                      <w:bCs w:val="false"/>
+                      <w:color w:val="1A1A1A"/>
+                      <w:sz w:val="13"/>
+                      <w:szCs w:val="13"/>
+                    </w:rPr>
+                    <w:t xml:space="preserve">Prob. target ≥ CLP 3,555 (price)</w:t>
+                  </w:r>
+                </w:p>
+              </w:tc>
+              <w:tc>
+                <w:tcPr>
+                  <w:tcW w:type="dxa" w:w="1500"/>
+                  <w:tcBorders>
+                    <w:top w:val="none" w:color="FFFFFF" w:sz="0"/>
+                    <w:left w:val="none" w:color="FFFFFF" w:sz="0"/>
+                    <w:bottom w:val="single" w:color="D5D9E0" w:sz="4"/>
+                    <w:right w:val="none" w:color="FFFFFF" w:sz="0"/>
+                  </w:tcBorders>
+                  <w:shd w:fill="FFFFFF" w:color="auto" w:val="clear"/>
+                  <w:tcMar>
+                    <w:top w:type="dxa" w:w="25"/>
+                    <w:left w:type="dxa" w:w="80"/>
+                    <w:bottom w:type="dxa" w:w="25"/>
+                    <w:right w:type="dxa" w:w="80"/>
+                  </w:tcMar>
+                  <w:vAlign w:val="center"/>
+                </w:tcPr>
+                <w:p>
+                  <w:pPr>
+                    <w:spacing w:line="216" w:lineRule="auto"/>
+                    <w:jc w:val="right"/>
+                  </w:pPr>
+                  <w:r>
+                    <w:rPr>
+                      <w:rFonts w:ascii="Arial" w:cs="Arial" w:eastAsia="Arial" w:hAnsi="Arial"/>
+                      <w:b w:val="false"/>
+                      <w:bCs w:val="false"/>
+                      <w:color w:val="1A1A1A"/>
+                      <w:sz w:val="13"/>
+                      <w:szCs w:val="13"/>
+                    </w:rPr>
+                    <w:t xml:space="preserve">0.0%</w:t>
+                  </w:r>
+                </w:p>
+              </w:tc>
+            </w:tr>
+            <w:tr>
+              <w:tc>
+                <w:tcPr>
+                  <w:tcW w:type="dxa" w:w="3400"/>
+                  <w:tcBorders>
+                    <w:top w:val="none" w:color="FFFFFF" w:sz="0"/>
+                    <w:left w:val="none" w:color="FFFFFF" w:sz="0"/>
+                    <w:bottom w:val="single" w:color="D5D9E0" w:sz="4"/>
+                    <w:right w:val="none" w:color="FFFFFF" w:sz="0"/>
+                  </w:tcBorders>
+                  <w:shd w:fill="F7F8FB" w:color="auto" w:val="clear"/>
+                  <w:tcMar>
+                    <w:top w:type="dxa" w:w="25"/>
+                    <w:left w:type="dxa" w:w="80"/>
+                    <w:bottom w:type="dxa" w:w="25"/>
+                    <w:right w:type="dxa" w:w="80"/>
+                  </w:tcMar>
+                  <w:vAlign w:val="center"/>
+                </w:tcPr>
+                <w:p>
+                  <w:pPr>
+                    <w:spacing w:line="216" w:lineRule="auto"/>
+                    <w:jc w:val="left"/>
+                  </w:pPr>
+                  <w:r>
+                    <w:rPr>
+                      <w:rFonts w:ascii="Arial" w:cs="Arial" w:eastAsia="Arial" w:hAnsi="Arial"/>
+                      <w:b w:val="false"/>
+                      <w:bCs w:val="false"/>
+                      <w:color w:val="1A1A1A"/>
+                      <w:sz w:val="13"/>
+                      <w:szCs w:val="13"/>
+                    </w:rPr>
+                    <w:t xml:space="preserve">Prob. target ≥ CLP 4,111 (consensus)</w:t>
+                  </w:r>
+                </w:p>
+              </w:tc>
+              <w:tc>
+                <w:tcPr>
+                  <w:tcW w:type="dxa" w:w="1500"/>
+                  <w:tcBorders>
+                    <w:top w:val="none" w:color="FFFFFF" w:sz="0"/>
+                    <w:left w:val="none" w:color="FFFFFF" w:sz="0"/>
+                    <w:bottom w:val="single" w:color="D5D9E0" w:sz="4"/>
+                    <w:right w:val="none" w:color="FFFFFF" w:sz="0"/>
+                  </w:tcBorders>
+                  <w:shd w:fill="F7F8FB" w:color="auto" w:val="clear"/>
+                  <w:tcMar>
+                    <w:top w:type="dxa" w:w="25"/>
+                    <w:left w:type="dxa" w:w="80"/>
+                    <w:bottom w:type="dxa" w:w="25"/>
+                    <w:right w:type="dxa" w:w="80"/>
+                  </w:tcMar>
+                  <w:vAlign w:val="center"/>
+                </w:tcPr>
+                <w:p>
+                  <w:pPr>
+                    <w:spacing w:line="216" w:lineRule="auto"/>
+                    <w:jc w:val="right"/>
+                  </w:pPr>
+                  <w:r>
+                    <w:rPr>
+                      <w:rFonts w:ascii="Arial" w:cs="Arial" w:eastAsia="Arial" w:hAnsi="Arial"/>
+                      <w:b w:val="false"/>
+                      <w:bCs w:val="false"/>
+                      <w:color w:val="1A1A1A"/>
+                      <w:sz w:val="13"/>
+                      <w:szCs w:val="13"/>
+                    </w:rPr>
+                    <w:t xml:space="preserve">0.0%</w:t>
+                  </w:r>
+                </w:p>
+              </w:tc>
+            </w:tr>
+            <w:tr>
+              <w:tc>
+                <w:tcPr>
+                  <w:tcW w:type="dxa" w:w="3400"/>
+                  <w:tcBorders>
+                    <w:top w:val="none" w:color="FFFFFF" w:sz="0"/>
+                    <w:left w:val="none" w:color="FFFFFF" w:sz="0"/>
+                    <w:bottom w:val="single" w:color="D5D9E0" w:sz="4"/>
+                    <w:right w:val="none" w:color="FFFFFF" w:sz="0"/>
+                  </w:tcBorders>
+                  <w:shd w:fill="FFFFFF" w:color="auto" w:val="clear"/>
+                  <w:tcMar>
+                    <w:top w:type="dxa" w:w="25"/>
+                    <w:left w:type="dxa" w:w="80"/>
+                    <w:bottom w:type="dxa" w:w="25"/>
+                    <w:right w:type="dxa" w:w="80"/>
+                  </w:tcMar>
+                  <w:vAlign w:val="center"/>
+                </w:tcPr>
+                <w:p>
+                  <w:pPr>
+                    <w:spacing w:line="216" w:lineRule="auto"/>
+                    <w:jc w:val="left"/>
+                  </w:pPr>
+                  <w:r>
+                    <w:rPr>
+                      <w:rFonts w:ascii="Arial" w:cs="Arial" w:eastAsia="Arial" w:hAnsi="Arial"/>
+                      <w:b w:val="false"/>
+                      <w:bCs w:val="false"/>
+                      <w:color w:val="1A1A1A"/>
+                      <w:sz w:val="13"/>
+                      <w:szCs w:val="13"/>
+                    </w:rPr>
+                    <w:t xml:space="preserve">Prob. target &lt; CLP 2,077 (base case)</w:t>
+                  </w:r>
+                </w:p>
+              </w:tc>
+              <w:tc>
+                <w:tcPr>
+                  <w:tcW w:type="dxa" w:w="1500"/>
+                  <w:tcBorders>
+                    <w:top w:val="none" w:color="FFFFFF" w:sz="0"/>
+                    <w:left w:val="none" w:color="FFFFFF" w:sz="0"/>
+                    <w:bottom w:val="single" w:color="D5D9E0" w:sz="4"/>
+                    <w:right w:val="none" w:color="FFFFFF" w:sz="0"/>
+                  </w:tcBorders>
+                  <w:shd w:fill="FFFFFF" w:color="auto" w:val="clear"/>
+                  <w:tcMar>
+                    <w:top w:type="dxa" w:w="25"/>
+                    <w:left w:type="dxa" w:w="80"/>
+                    <w:bottom w:type="dxa" w:w="25"/>
+                    <w:right w:type="dxa" w:w="80"/>
+                  </w:tcMar>
+                  <w:vAlign w:val="center"/>
+                </w:tcPr>
+                <w:p>
+                  <w:pPr>
+                    <w:spacing w:line="216" w:lineRule="auto"/>
+                    <w:jc w:val="right"/>
+                  </w:pPr>
+                  <w:r>
+                    <w:rPr>
+                      <w:rFonts w:ascii="Arial" w:cs="Arial" w:eastAsia="Arial" w:hAnsi="Arial"/>
+                      <w:b w:val="false"/>
+                      <w:bCs w:val="false"/>
+                      <w:color w:val="1A1A1A"/>
+                      <w:sz w:val="13"/>
+                      <w:szCs w:val="13"/>
+                    </w:rPr>
+                    <w:t xml:space="preserve">57.3%</w:t>
+                  </w:r>
+                </w:p>
+              </w:tc>
+            </w:tr>
+          </w:tbl>
+          <w:p>
+            <w:pPr>
+              <w:spacing w:after="20" w:before="40"/>
+            </w:pPr>
+            <w:r>
+              <w:rPr>
+                <w:rFonts w:ascii="Arial" w:cs="Arial" w:eastAsia="Arial" w:hAnsi="Arial"/>
+                <w:color w:val="1A1A1A"/>
+                <w:sz w:val="13"/>
+                <w:szCs w:val="13"/>
+              </w:rPr>
+              <w:t xml:space="preserve">Contribution to variance (rank correlation): WACC 80.8%; Same-store rent 6.2%; EBITDA margin 6.1%; Nominal g 3.2%.</w:t>
+            </w:r>
+          </w:p>
+        </w:tc>
+        <w:tc>
+          <w:tcPr>
+            <w:tcW w:type="dxa" w:w="216"/>
+            <w:tcBorders>
+              <w:top w:val="none" w:color="FFFFFF" w:sz="0"/>
+              <w:left w:val="none" w:color="FFFFFF" w:sz="0"/>
+              <w:bottom w:val="none" w:color="FFFFFF" w:sz="0"/>
+              <w:right w:val="none" w:color="FFFFFF" w:sz="0"/>
+            </w:tcBorders>
+            <w:tcMar>
+              <w:top w:type="dxa" w:w="0"/>
+              <w:left w:type="dxa" w:w="0"/>
+              <w:bottom w:type="dxa" w:w="0"/>
+              <w:right w:type="dxa" w:w="0"/>
+            </w:tcMar>
+            <w:vAlign w:val="top"/>
+          </w:tcPr>
+          <w:p/>
+        </w:tc>
+        <w:tc>
+          <w:tcPr>
+            <w:tcW w:type="dxa" w:w="5225"/>
+            <w:tcBorders>
+              <w:top w:val="none" w:color="FFFFFF" w:sz="0"/>
+              <w:left w:val="none" w:color="FFFFFF" w:sz="0"/>
+              <w:bottom w:val="none" w:color="FFFFFF" w:sz="0"/>
+              <w:right w:val="none" w:color="FFFFFF" w:sz="0"/>
+            </w:tcBorders>
+            <w:tcMar>
+              <w:top w:type="dxa" w:w="0"/>
+              <w:left w:type="dxa" w:w="0"/>
+              <w:bottom w:type="dxa" w:w="0"/>
+              <w:right w:type="dxa" w:w="0"/>
+            </w:tcMar>
+            <w:vAlign w:val="top"/>
+          </w:tcPr>
+          <w:p>
+            <w:pPr>
+              <w:spacing w:after="30" w:before="20" w:line="228" w:lineRule="auto"/>
             </w:pPr>
             <w:r>
               <w:rPr>
                 <w:rFonts w:ascii="Arial" w:cs="Arial" w:eastAsia="Arial" w:hAnsi="Arial"/>
                 <w:b/>
                 <w:bCs/>
-                <w:color w:val="1A1A1A"/>
-                <w:sz w:val="13"/>
-                <w:szCs w:val="13"/>
-              </w:rPr>
-              <w:t xml:space="preserve">Base</w:t>
-            </w:r>
-          </w:p>
-        </w:tc>
-        <w:tc>
-          <w:tcPr>
-            <w:tcW w:type="dxa" w:w="5666"/>
-            <w:tcBorders>
-              <w:top w:val="none" w:color="FFFFFF" w:sz="0"/>
-              <w:left w:val="none" w:color="FFFFFF" w:sz="0"/>
-              <w:bottom w:val="single" w:color="D5D9E0" w:sz="4"/>
-              <w:right w:val="none" w:color="FFFFFF" w:sz="0"/>
-            </w:tcBorders>
-            <w:shd w:fill="FDF1CC" w:color="auto" w:val="clear"/>
-            <w:tcMar>
-              <w:top w:type="dxa" w:w="25"/>
-              <w:left w:type="dxa" w:w="80"/>
-              <w:bottom w:type="dxa" w:w="25"/>
-              <w:right w:type="dxa" w:w="80"/>
-            </w:tcMar>
-            <w:vAlign w:val="center"/>
-          </w:tcPr>
-          <w:p>
-            <w:pPr>
-              <w:spacing w:line="216" w:lineRule="auto"/>
-              <w:jc w:val="left"/>
-            </w:pPr>
-            <w:r>
-              <w:rPr>
-                <w:rFonts w:ascii="Arial" w:cs="Arial" w:eastAsia="Arial" w:hAnsi="Arial"/>
-                <w:b/>
-                <w:bCs/>
-                <w:color w:val="1A1A1A"/>
-                <w:sz w:val="13"/>
-                <w:szCs w:val="13"/>
-              </w:rPr>
-              <w:t xml:space="preserve">Central: model v4; nominal WACC 10.54% → 10.41%; g 3.0%; margin 79.7%</w:t>
-            </w:r>
-          </w:p>
-        </w:tc>
-        <w:tc>
-          <w:tcPr>
-            <w:tcW w:type="dxa" w:w="600"/>
-            <w:tcBorders>
-              <w:top w:val="none" w:color="FFFFFF" w:sz="0"/>
-              <w:left w:val="none" w:color="FFFFFF" w:sz="0"/>
-              <w:bottom w:val="single" w:color="D5D9E0" w:sz="4"/>
-              <w:right w:val="none" w:color="FFFFFF" w:sz="0"/>
-            </w:tcBorders>
-            <w:shd w:fill="FDF1CC" w:color="auto" w:val="clear"/>
-            <w:tcMar>
-              <w:top w:type="dxa" w:w="25"/>
-              <w:left w:type="dxa" w:w="80"/>
-              <w:bottom w:type="dxa" w:w="25"/>
-              <w:right w:type="dxa" w:w="80"/>
-            </w:tcMar>
-            <w:vAlign w:val="center"/>
-          </w:tcPr>
-          <w:p>
-            <w:pPr>
-              <w:spacing w:line="216" w:lineRule="auto"/>
-              <w:jc w:val="right"/>
-            </w:pPr>
-            <w:r>
-              <w:rPr>
-                <w:rFonts w:ascii="Arial" w:cs="Arial" w:eastAsia="Arial" w:hAnsi="Arial"/>
-                <w:b/>
-                <w:bCs/>
-                <w:color w:val="1A1A1A"/>
-                <w:sz w:val="13"/>
-                <w:szCs w:val="13"/>
-              </w:rPr>
-              <w:t xml:space="preserve">50%</w:t>
-            </w:r>
-          </w:p>
-        </w:tc>
-        <w:tc>
-          <w:tcPr>
-            <w:tcW w:type="dxa" w:w="1100"/>
-            <w:tcBorders>
-              <w:top w:val="none" w:color="FFFFFF" w:sz="0"/>
-              <w:left w:val="none" w:color="FFFFFF" w:sz="0"/>
-              <w:bottom w:val="single" w:color="D5D9E0" w:sz="4"/>
-              <w:right w:val="none" w:color="FFFFFF" w:sz="0"/>
-            </w:tcBorders>
-            <w:shd w:fill="FDF1CC" w:color="auto" w:val="clear"/>
-            <w:tcMar>
-              <w:top w:type="dxa" w:w="25"/>
-              <w:left w:type="dxa" w:w="80"/>
-              <w:bottom w:type="dxa" w:w="25"/>
-              <w:right w:type="dxa" w:w="80"/>
-            </w:tcMar>
-            <w:vAlign w:val="center"/>
-          </w:tcPr>
-          <w:p>
-            <w:pPr>
-              <w:spacing w:line="216" w:lineRule="auto"/>
-              <w:jc w:val="right"/>
-            </w:pPr>
-            <w:r>
-              <w:rPr>
-                <w:rFonts w:ascii="Arial" w:cs="Arial" w:eastAsia="Arial" w:hAnsi="Arial"/>
-                <w:b/>
-                <w:bCs/>
-                <w:color w:val="1A1A1A"/>
-                <w:sz w:val="13"/>
-                <w:szCs w:val="13"/>
-              </w:rPr>
-              <w:t xml:space="preserve">1,859</w:t>
-            </w:r>
-          </w:p>
-        </w:tc>
-        <w:tc>
-          <w:tcPr>
-            <w:tcW w:type="dxa" w:w="1200"/>
-            <w:tcBorders>
-              <w:top w:val="none" w:color="FFFFFF" w:sz="0"/>
-              <w:left w:val="none" w:color="FFFFFF" w:sz="0"/>
-              <w:bottom w:val="single" w:color="D5D9E0" w:sz="4"/>
-              <w:right w:val="none" w:color="FFFFFF" w:sz="0"/>
-            </w:tcBorders>
-            <w:shd w:fill="FDF1CC" w:color="auto" w:val="clear"/>
-            <w:tcMar>
-              <w:top w:type="dxa" w:w="25"/>
-              <w:left w:type="dxa" w:w="80"/>
-              <w:bottom w:type="dxa" w:w="25"/>
-              <w:right w:type="dxa" w:w="80"/>
-            </w:tcMar>
-            <w:vAlign w:val="center"/>
-          </w:tcPr>
-          <w:p>
-            <w:pPr>
-              <w:spacing w:line="216" w:lineRule="auto"/>
-              <w:jc w:val="right"/>
-            </w:pPr>
-            <w:r>
-              <w:rPr>
-                <w:rFonts w:ascii="Arial" w:cs="Arial" w:eastAsia="Arial" w:hAnsi="Arial"/>
-                <w:b/>
-                <w:bCs/>
-                <w:color w:val="1A1A1A"/>
-                <w:sz w:val="13"/>
-                <w:szCs w:val="13"/>
-              </w:rPr>
-              <w:t xml:space="preserve">2,077</w:t>
-            </w:r>
-          </w:p>
-        </w:tc>
-        <w:tc>
-          <w:tcPr>
-            <w:tcW w:type="dxa" w:w="1000"/>
-            <w:tcBorders>
-              <w:top w:val="none" w:color="FFFFFF" w:sz="0"/>
-              <w:left w:val="none" w:color="FFFFFF" w:sz="0"/>
-              <w:bottom w:val="single" w:color="D5D9E0" w:sz="4"/>
-              <w:right w:val="none" w:color="FFFFFF" w:sz="0"/>
-            </w:tcBorders>
-            <w:shd w:fill="FDF1CC" w:color="auto" w:val="clear"/>
-            <w:tcMar>
-              <w:top w:type="dxa" w:w="25"/>
-              <w:left w:type="dxa" w:w="80"/>
-              <w:bottom w:type="dxa" w:w="25"/>
-              <w:right w:type="dxa" w:w="80"/>
-            </w:tcMar>
-            <w:vAlign w:val="center"/>
-          </w:tcPr>
-          <w:p>
-            <w:pPr>
-              <w:spacing w:line="216" w:lineRule="auto"/>
-              <w:jc w:val="right"/>
-            </w:pPr>
-            <w:r>
-              <w:rPr>
-                <w:rFonts w:ascii="Arial" w:cs="Arial" w:eastAsia="Arial" w:hAnsi="Arial"/>
-                <w:b/>
-                <w:bCs/>
-                <w:color w:val="1A1A1A"/>
-                <w:sz w:val="13"/>
-                <w:szCs w:val="13"/>
-              </w:rPr>
-              <w:t xml:space="preserve">−41.6%</w:t>
-            </w:r>
-          </w:p>
-        </w:tc>
-      </w:tr>
-      <w:tr>
-        <w:tc>
-          <w:tcPr>
-            <w:tcW w:type="dxa" w:w="1100"/>
-            <w:tcBorders>
-              <w:top w:val="none" w:color="FFFFFF" w:sz="0"/>
-              <w:left w:val="none" w:color="FFFFFF" w:sz="0"/>
-              <w:bottom w:val="single" w:color="D5D9E0" w:sz="4"/>
-              <w:right w:val="none" w:color="FFFFFF" w:sz="0"/>
-            </w:tcBorders>
-            <w:shd w:fill="F7F8FB" w:color="auto" w:val="clear"/>
-            <w:tcMar>
-              <w:top w:type="dxa" w:w="25"/>
-              <w:left w:type="dxa" w:w="80"/>
-              <w:bottom w:type="dxa" w:w="25"/>
-              <w:right w:type="dxa" w:w="80"/>
-            </w:tcMar>
-            <w:vAlign w:val="center"/>
-          </w:tcPr>
-          <w:p>
-            <w:pPr>
-              <w:spacing w:line="216" w:lineRule="auto"/>
-              <w:jc w:val="left"/>
-            </w:pPr>
-            <w:r>
-              <w:rPr>
-                <w:rFonts w:ascii="Arial" w:cs="Arial" w:eastAsia="Arial" w:hAnsi="Arial"/>
-                <w:b w:val="false"/>
-                <w:bCs w:val="false"/>
-                <w:color w:val="1A1A1A"/>
-                <w:sz w:val="13"/>
-                <w:szCs w:val="13"/>
-              </w:rPr>
-              <w:t xml:space="preserve">Bull</w:t>
-            </w:r>
-          </w:p>
-        </w:tc>
-        <w:tc>
-          <w:tcPr>
-            <w:tcW w:type="dxa" w:w="5666"/>
-            <w:tcBorders>
-              <w:top w:val="none" w:color="FFFFFF" w:sz="0"/>
-              <w:left w:val="none" w:color="FFFFFF" w:sz="0"/>
-              <w:bottom w:val="single" w:color="D5D9E0" w:sz="4"/>
-              <w:right w:val="none" w:color="FFFFFF" w:sz="0"/>
-            </w:tcBorders>
-            <w:shd w:fill="F7F8FB" w:color="auto" w:val="clear"/>
-            <w:tcMar>
-              <w:top w:type="dxa" w:w="25"/>
-              <w:left w:type="dxa" w:w="80"/>
-              <w:bottom w:type="dxa" w:w="25"/>
-              <w:right w:type="dxa" w:w="80"/>
-            </w:tcMar>
-            <w:vAlign w:val="center"/>
-          </w:tcPr>
-          <w:p>
-            <w:pPr>
-              <w:spacing w:line="216" w:lineRule="auto"/>
-              <w:jc w:val="left"/>
-            </w:pPr>
-            <w:r>
-              <w:rPr>
-                <w:rFonts w:ascii="Arial" w:cs="Arial" w:eastAsia="Arial" w:hAnsi="Arial"/>
-                <w:b w:val="false"/>
-                <w:bCs w:val="false"/>
-                <w:color w:val="1A1A1A"/>
-                <w:sz w:val="13"/>
-                <w:szCs w:val="13"/>
-              </w:rPr>
-              <w:t xml:space="preserve">Everything goes right: nominal WACC −100 bp; margin 81.3%, occupancy 96.6%, same-store rent 9.4%, tenant sales 9.9%, real growth at the Note 11 ceiling, visitors 17.3%, maintenance capex 4.8%; cash tax capped at 23%</w:t>
-            </w:r>
-          </w:p>
-        </w:tc>
-        <w:tc>
-          <w:tcPr>
-            <w:tcW w:type="dxa" w:w="600"/>
-            <w:tcBorders>
-              <w:top w:val="none" w:color="FFFFFF" w:sz="0"/>
-              <w:left w:val="none" w:color="FFFFFF" w:sz="0"/>
-              <w:bottom w:val="single" w:color="D5D9E0" w:sz="4"/>
-              <w:right w:val="none" w:color="FFFFFF" w:sz="0"/>
-            </w:tcBorders>
-            <w:shd w:fill="F7F8FB" w:color="auto" w:val="clear"/>
-            <w:tcMar>
-              <w:top w:type="dxa" w:w="25"/>
-              <w:left w:type="dxa" w:w="80"/>
-              <w:bottom w:type="dxa" w:w="25"/>
-              <w:right w:type="dxa" w:w="80"/>
-            </w:tcMar>
-            <w:vAlign w:val="center"/>
-          </w:tcPr>
-          <w:p>
-            <w:pPr>
-              <w:spacing w:line="216" w:lineRule="auto"/>
-              <w:jc w:val="right"/>
-            </w:pPr>
-            <w:r>
-              <w:rPr>
-                <w:rFonts w:ascii="Arial" w:cs="Arial" w:eastAsia="Arial" w:hAnsi="Arial"/>
-                <w:b w:val="false"/>
-                <w:bCs w:val="false"/>
-                <w:color w:val="1A1A1A"/>
-                <w:sz w:val="13"/>
-                <w:szCs w:val="13"/>
-              </w:rPr>
-              <w:t xml:space="preserve">25%</w:t>
-            </w:r>
-          </w:p>
-        </w:tc>
-        <w:tc>
-          <w:tcPr>
-            <w:tcW w:type="dxa" w:w="1100"/>
-            <w:tcBorders>
-              <w:top w:val="none" w:color="FFFFFF" w:sz="0"/>
-              <w:left w:val="none" w:color="FFFFFF" w:sz="0"/>
-              <w:bottom w:val="single" w:color="D5D9E0" w:sz="4"/>
-              <w:right w:val="none" w:color="FFFFFF" w:sz="0"/>
-            </w:tcBorders>
-            <w:shd w:fill="F7F8FB" w:color="auto" w:val="clear"/>
-            <w:tcMar>
-              <w:top w:type="dxa" w:w="25"/>
-              <w:left w:type="dxa" w:w="80"/>
-              <w:bottom w:type="dxa" w:w="25"/>
-              <w:right w:type="dxa" w:w="80"/>
-            </w:tcMar>
-            <w:vAlign w:val="center"/>
-          </w:tcPr>
-          <w:p>
-            <w:pPr>
-              <w:spacing w:line="216" w:lineRule="auto"/>
-              <w:jc w:val="right"/>
-            </w:pPr>
-            <w:r>
-              <w:rPr>
-                <w:rFonts w:ascii="Arial" w:cs="Arial" w:eastAsia="Arial" w:hAnsi="Arial"/>
-                <w:b w:val="false"/>
-                <w:bCs w:val="false"/>
-                <w:color w:val="1A1A1A"/>
-                <w:sz w:val="13"/>
-                <w:szCs w:val="13"/>
-              </w:rPr>
-              <w:t xml:space="preserve">2,906</w:t>
-            </w:r>
-          </w:p>
-        </w:tc>
-        <w:tc>
-          <w:tcPr>
-            <w:tcW w:type="dxa" w:w="1200"/>
-            <w:tcBorders>
-              <w:top w:val="none" w:color="FFFFFF" w:sz="0"/>
-              <w:left w:val="none" w:color="FFFFFF" w:sz="0"/>
-              <w:bottom w:val="single" w:color="D5D9E0" w:sz="4"/>
-              <w:right w:val="none" w:color="FFFFFF" w:sz="0"/>
-            </w:tcBorders>
-            <w:shd w:fill="F7F8FB" w:color="auto" w:val="clear"/>
-            <w:tcMar>
-              <w:top w:type="dxa" w:w="25"/>
-              <w:left w:type="dxa" w:w="80"/>
-              <w:bottom w:type="dxa" w:w="25"/>
-              <w:right w:type="dxa" w:w="80"/>
-            </w:tcMar>
-            <w:vAlign w:val="center"/>
-          </w:tcPr>
-          <w:p>
-            <w:pPr>
-              <w:spacing w:line="216" w:lineRule="auto"/>
-              <w:jc w:val="right"/>
-            </w:pPr>
-            <w:r>
-              <w:rPr>
-                <w:rFonts w:ascii="Arial" w:cs="Arial" w:eastAsia="Arial" w:hAnsi="Arial"/>
-                <w:b w:val="false"/>
-                <w:bCs w:val="false"/>
-                <w:color w:val="1A1A1A"/>
-                <w:sz w:val="13"/>
-                <w:szCs w:val="13"/>
-              </w:rPr>
-              <w:t xml:space="preserve">2,915</w:t>
-            </w:r>
-          </w:p>
-        </w:tc>
-        <w:tc>
-          <w:tcPr>
-            <w:tcW w:type="dxa" w:w="1000"/>
-            <w:tcBorders>
-              <w:top w:val="none" w:color="FFFFFF" w:sz="0"/>
-              <w:left w:val="none" w:color="FFFFFF" w:sz="0"/>
-              <w:bottom w:val="single" w:color="D5D9E0" w:sz="4"/>
-              <w:right w:val="none" w:color="FFFFFF" w:sz="0"/>
-            </w:tcBorders>
-            <w:shd w:fill="F7F8FB" w:color="auto" w:val="clear"/>
-            <w:tcMar>
-              <w:top w:type="dxa" w:w="25"/>
-              <w:left w:type="dxa" w:w="80"/>
-              <w:bottom w:type="dxa" w:w="25"/>
-              <w:right w:type="dxa" w:w="80"/>
-            </w:tcMar>
-            <w:vAlign w:val="center"/>
-          </w:tcPr>
-          <w:p>
-            <w:pPr>
-              <w:spacing w:line="216" w:lineRule="auto"/>
-              <w:jc w:val="right"/>
-            </w:pPr>
-            <w:r>
-              <w:rPr>
-                <w:rFonts w:ascii="Arial" w:cs="Arial" w:eastAsia="Arial" w:hAnsi="Arial"/>
-                <w:b w:val="false"/>
-                <w:bCs w:val="false"/>
-                <w:color w:val="1A1A1A"/>
-                <w:sz w:val="13"/>
-                <w:szCs w:val="13"/>
-              </w:rPr>
-              <w:t xml:space="preserve">−18.0%</w:t>
-            </w:r>
-          </w:p>
-        </w:tc>
-      </w:tr>
-      <w:tr>
-        <w:tc>
-          <w:tcPr>
-            <w:tcW w:type="dxa" w:w="1100"/>
-            <w:tcBorders>
-              <w:top w:val="none" w:color="FFFFFF" w:sz="0"/>
-              <w:left w:val="none" w:color="FFFFFF" w:sz="0"/>
-              <w:bottom w:val="single" w:color="D5D9E0" w:sz="4"/>
-              <w:right w:val="none" w:color="FFFFFF" w:sz="0"/>
-            </w:tcBorders>
-            <w:shd w:fill="FFFFFF" w:color="auto" w:val="clear"/>
-            <w:tcMar>
-              <w:top w:type="dxa" w:w="25"/>
-              <w:left w:type="dxa" w:w="80"/>
-              <w:bottom w:type="dxa" w:w="25"/>
-              <w:right w:type="dxa" w:w="80"/>
-            </w:tcMar>
-            <w:vAlign w:val="center"/>
-          </w:tcPr>
-          <w:p>
-            <w:pPr>
-              <w:spacing w:line="216" w:lineRule="auto"/>
-              <w:jc w:val="left"/>
-            </w:pPr>
-            <w:r>
-              <w:rPr>
-                <w:rFonts w:ascii="Arial" w:cs="Arial" w:eastAsia="Arial" w:hAnsi="Arial"/>
-                <w:b w:val="false"/>
-                <w:bCs w:val="false"/>
-                <w:color w:val="1A1A1A"/>
-                <w:sz w:val="13"/>
-                <w:szCs w:val="13"/>
-              </w:rPr>
-              <w:t xml:space="preserve">Weighted</w:t>
-            </w:r>
-          </w:p>
-        </w:tc>
-        <w:tc>
-          <w:tcPr>
-            <w:tcW w:type="dxa" w:w="5666"/>
-            <w:tcBorders>
-              <w:top w:val="none" w:color="FFFFFF" w:sz="0"/>
-              <w:left w:val="none" w:color="FFFFFF" w:sz="0"/>
-              <w:bottom w:val="single" w:color="D5D9E0" w:sz="4"/>
-              <w:right w:val="none" w:color="FFFFFF" w:sz="0"/>
-            </w:tcBorders>
-            <w:shd w:fill="FFFFFF" w:color="auto" w:val="clear"/>
-            <w:tcMar>
-              <w:top w:type="dxa" w:w="25"/>
-              <w:left w:type="dxa" w:w="80"/>
-              <w:bottom w:type="dxa" w:w="25"/>
-              <w:right w:type="dxa" w:w="80"/>
-            </w:tcMar>
-            <w:vAlign w:val="center"/>
-          </w:tcPr>
-          <w:p>
-            <w:pPr>
-              <w:spacing w:line="216" w:lineRule="auto"/>
-              <w:jc w:val="left"/>
-            </w:pPr>
-            <w:r>
-              <w:rPr>
-                <w:rFonts w:ascii="Arial" w:cs="Arial" w:eastAsia="Arial" w:hAnsi="Arial"/>
-                <w:b w:val="false"/>
-                <w:bCs w:val="false"/>
-                <w:color w:val="1A1A1A"/>
-                <w:sz w:val="13"/>
-                <w:szCs w:val="13"/>
-              </w:rPr>
-              <w:t xml:space="preserve">25 / 50 / 25 (team assumption, to be validated)</w:t>
-            </w:r>
-          </w:p>
-        </w:tc>
-        <w:tc>
-          <w:tcPr>
-            <w:tcW w:type="dxa" w:w="600"/>
-            <w:tcBorders>
-              <w:top w:val="none" w:color="FFFFFF" w:sz="0"/>
-              <w:left w:val="none" w:color="FFFFFF" w:sz="0"/>
-              <w:bottom w:val="single" w:color="D5D9E0" w:sz="4"/>
-              <w:right w:val="none" w:color="FFFFFF" w:sz="0"/>
-            </w:tcBorders>
-            <w:shd w:fill="FFFFFF" w:color="auto" w:val="clear"/>
-            <w:tcMar>
-              <w:top w:type="dxa" w:w="25"/>
-              <w:left w:type="dxa" w:w="80"/>
-              <w:bottom w:type="dxa" w:w="25"/>
-              <w:right w:type="dxa" w:w="80"/>
-            </w:tcMar>
-            <w:vAlign w:val="center"/>
-          </w:tcPr>
-          <w:p>
-            <w:pPr>
-              <w:spacing w:line="216" w:lineRule="auto"/>
-              <w:jc w:val="right"/>
-            </w:pPr>
-            <w:r>
-              <w:rPr>
-                <w:rFonts w:ascii="Arial" w:cs="Arial" w:eastAsia="Arial" w:hAnsi="Arial"/>
-                <w:b w:val="false"/>
-                <w:bCs w:val="false"/>
-                <w:color w:val="1A1A1A"/>
-                <w:sz w:val="13"/>
-                <w:szCs w:val="13"/>
-              </w:rPr>
-              <w:t xml:space="preserve">100%</w:t>
-            </w:r>
-          </w:p>
-        </w:tc>
-        <w:tc>
-          <w:tcPr>
-            <w:tcW w:type="dxa" w:w="1100"/>
-            <w:tcBorders>
-              <w:top w:val="none" w:color="FFFFFF" w:sz="0"/>
-              <w:left w:val="none" w:color="FFFFFF" w:sz="0"/>
-              <w:bottom w:val="single" w:color="D5D9E0" w:sz="4"/>
-              <w:right w:val="none" w:color="FFFFFF" w:sz="0"/>
-            </w:tcBorders>
-            <w:shd w:fill="FFFFFF" w:color="auto" w:val="clear"/>
-            <w:tcMar>
-              <w:top w:type="dxa" w:w="25"/>
-              <w:left w:type="dxa" w:w="80"/>
-              <w:bottom w:type="dxa" w:w="25"/>
-              <w:right w:type="dxa" w:w="80"/>
-            </w:tcMar>
-            <w:vAlign w:val="center"/>
-          </w:tcPr>
-          <w:p>
-            <w:pPr>
-              <w:spacing w:line="216" w:lineRule="auto"/>
-              <w:jc w:val="right"/>
-            </w:pPr>
-            <w:r>
-              <w:rPr>
-                <w:rFonts w:ascii="Arial" w:cs="Arial" w:eastAsia="Arial" w:hAnsi="Arial"/>
-                <w:b w:val="false"/>
-                <w:bCs w:val="false"/>
-                <w:color w:val="1A1A1A"/>
-                <w:sz w:val="13"/>
-                <w:szCs w:val="13"/>
-              </w:rPr>
-              <w:t xml:space="preserve">1,953</w:t>
-            </w:r>
-          </w:p>
-        </w:tc>
-        <w:tc>
-          <w:tcPr>
-            <w:tcW w:type="dxa" w:w="1200"/>
-            <w:tcBorders>
-              <w:top w:val="none" w:color="FFFFFF" w:sz="0"/>
-              <w:left w:val="none" w:color="FFFFFF" w:sz="0"/>
-              <w:bottom w:val="single" w:color="D5D9E0" w:sz="4"/>
-              <w:right w:val="none" w:color="FFFFFF" w:sz="0"/>
-            </w:tcBorders>
-            <w:shd w:fill="FFFFFF" w:color="auto" w:val="clear"/>
-            <w:tcMar>
-              <w:top w:type="dxa" w:w="25"/>
-              <w:left w:type="dxa" w:w="80"/>
-              <w:bottom w:type="dxa" w:w="25"/>
-              <w:right w:type="dxa" w:w="80"/>
-            </w:tcMar>
-            <w:vAlign w:val="center"/>
-          </w:tcPr>
-          <w:p>
-            <w:pPr>
-              <w:spacing w:line="216" w:lineRule="auto"/>
-              <w:jc w:val="right"/>
-            </w:pPr>
-            <w:r>
-              <w:rPr>
-                <w:rFonts w:ascii="Arial" w:cs="Arial" w:eastAsia="Arial" w:hAnsi="Arial"/>
-                <w:b w:val="false"/>
-                <w:bCs w:val="false"/>
-                <w:color w:val="1A1A1A"/>
-                <w:sz w:val="13"/>
-                <w:szCs w:val="13"/>
-              </w:rPr>
-              <w:t xml:space="preserve">2,153</w:t>
-            </w:r>
-          </w:p>
-        </w:tc>
-        <w:tc>
-          <w:tcPr>
-            <w:tcW w:type="dxa" w:w="1000"/>
-            <w:tcBorders>
-              <w:top w:val="none" w:color="FFFFFF" w:sz="0"/>
-              <w:left w:val="none" w:color="FFFFFF" w:sz="0"/>
-              <w:bottom w:val="single" w:color="D5D9E0" w:sz="4"/>
-              <w:right w:val="none" w:color="FFFFFF" w:sz="0"/>
-            </w:tcBorders>
-            <w:shd w:fill="FFFFFF" w:color="auto" w:val="clear"/>
-            <w:tcMar>
-              <w:top w:type="dxa" w:w="25"/>
-              <w:left w:type="dxa" w:w="80"/>
-              <w:bottom w:type="dxa" w:w="25"/>
-              <w:right w:type="dxa" w:w="80"/>
-            </w:tcMar>
-            <w:vAlign w:val="center"/>
-          </w:tcPr>
-          <w:p>
-            <w:pPr>
-              <w:spacing w:line="216" w:lineRule="auto"/>
-              <w:jc w:val="right"/>
-            </w:pPr>
-            <w:r>
-              <w:rPr>
-                <w:rFonts w:ascii="Arial" w:cs="Arial" w:eastAsia="Arial" w:hAnsi="Arial"/>
-                <w:b w:val="false"/>
-                <w:bCs w:val="false"/>
-                <w:color w:val="1A1A1A"/>
-                <w:sz w:val="13"/>
-                <w:szCs w:val="13"/>
-              </w:rPr>
-              <w:t xml:space="preserve">−39.4%</w:t>
-            </w:r>
-          </w:p>
-        </w:tc>
-      </w:tr>
-      <w:tr>
-        <w:tc>
-          <w:tcPr>
-            <w:tcW w:type="dxa" w:w="1100"/>
-            <w:tcBorders>
-              <w:top w:val="none" w:color="FFFFFF" w:sz="0"/>
-              <w:left w:val="none" w:color="FFFFFF" w:sz="0"/>
-              <w:bottom w:val="single" w:color="D5D9E0" w:sz="4"/>
-              <w:right w:val="none" w:color="FFFFFF" w:sz="0"/>
-            </w:tcBorders>
-            <w:shd w:fill="F7F8FB" w:color="auto" w:val="clear"/>
-            <w:tcMar>
-              <w:top w:type="dxa" w:w="25"/>
-              <w:left w:type="dxa" w:w="80"/>
-              <w:bottom w:type="dxa" w:w="25"/>
-              <w:right w:type="dxa" w:w="80"/>
-            </w:tcMar>
-            <w:vAlign w:val="center"/>
-          </w:tcPr>
-          <w:p>
-            <w:pPr>
-              <w:spacing w:line="216" w:lineRule="auto"/>
-              <w:jc w:val="left"/>
-            </w:pPr>
-            <w:r>
-              <w:rPr>
-                <w:rFonts w:ascii="Arial" w:cs="Arial" w:eastAsia="Arial" w:hAnsi="Arial"/>
-                <w:b w:val="false"/>
-                <w:bCs w:val="false"/>
-                <w:color w:val="1A1A1A"/>
-                <w:sz w:val="13"/>
-                <w:szCs w:val="13"/>
-              </w:rPr>
-              <w:t xml:space="preserve">Appraisers</w:t>
-            </w:r>
-          </w:p>
-        </w:tc>
-        <w:tc>
-          <w:tcPr>
-            <w:tcW w:type="dxa" w:w="5666"/>
-            <w:tcBorders>
-              <w:top w:val="none" w:color="FFFFFF" w:sz="0"/>
-              <w:left w:val="none" w:color="FFFFFF" w:sz="0"/>
-              <w:bottom w:val="single" w:color="D5D9E0" w:sz="4"/>
-              <w:right w:val="none" w:color="FFFFFF" w:sz="0"/>
-            </w:tcBorders>
-            <w:shd w:fill="F7F8FB" w:color="auto" w:val="clear"/>
-            <w:tcMar>
-              <w:top w:type="dxa" w:w="25"/>
-              <w:left w:type="dxa" w:w="80"/>
-              <w:bottom w:type="dxa" w:w="25"/>
-              <w:right w:type="dxa" w:w="80"/>
-            </w:tcMar>
-            <w:vAlign w:val="center"/>
-          </w:tcPr>
-          <w:p>
-            <w:pPr>
-              <w:spacing w:line="216" w:lineRule="auto"/>
-              <w:jc w:val="left"/>
-            </w:pPr>
-            <w:r>
-              <w:rPr>
-                <w:rFonts w:ascii="Arial" w:cs="Arial" w:eastAsia="Arial" w:hAnsi="Arial"/>
-                <w:b w:val="false"/>
-                <w:bCs w:val="false"/>
-                <w:color w:val="1A1A1A"/>
-                <w:sz w:val="13"/>
-                <w:szCs w:val="13"/>
-              </w:rPr>
-              <w:t xml:space="preserve">Nominal WACC 8.72% (5.55% real, Note 11) in all periods</w:t>
-            </w:r>
-          </w:p>
-        </w:tc>
-        <w:tc>
-          <w:tcPr>
-            <w:tcW w:type="dxa" w:w="600"/>
-            <w:tcBorders>
-              <w:top w:val="none" w:color="FFFFFF" w:sz="0"/>
-              <w:left w:val="none" w:color="FFFFFF" w:sz="0"/>
-              <w:bottom w:val="single" w:color="D5D9E0" w:sz="4"/>
-              <w:right w:val="none" w:color="FFFFFF" w:sz="0"/>
-            </w:tcBorders>
-            <w:shd w:fill="F7F8FB" w:color="auto" w:val="clear"/>
-            <w:tcMar>
-              <w:top w:type="dxa" w:w="25"/>
-              <w:left w:type="dxa" w:w="80"/>
-              <w:bottom w:type="dxa" w:w="25"/>
-              <w:right w:type="dxa" w:w="80"/>
-            </w:tcMar>
-            <w:vAlign w:val="center"/>
-          </w:tcPr>
-          <w:p>
-            <w:pPr>
-              <w:spacing w:line="216" w:lineRule="auto"/>
-              <w:jc w:val="right"/>
-            </w:pPr>
-            <w:r>
-              <w:rPr>
-                <w:rFonts w:ascii="Arial" w:cs="Arial" w:eastAsia="Arial" w:hAnsi="Arial"/>
-                <w:b w:val="false"/>
-                <w:bCs w:val="false"/>
-                <w:color w:val="1A1A1A"/>
-                <w:sz w:val="13"/>
-                <w:szCs w:val="13"/>
-              </w:rPr>
-              <w:t xml:space="preserve"> </w:t>
-            </w:r>
-          </w:p>
-        </w:tc>
-        <w:tc>
-          <w:tcPr>
-            <w:tcW w:type="dxa" w:w="1100"/>
-            <w:tcBorders>
-              <w:top w:val="none" w:color="FFFFFF" w:sz="0"/>
-              <w:left w:val="none" w:color="FFFFFF" w:sz="0"/>
-              <w:bottom w:val="single" w:color="D5D9E0" w:sz="4"/>
-              <w:right w:val="none" w:color="FFFFFF" w:sz="0"/>
-            </w:tcBorders>
-            <w:shd w:fill="F7F8FB" w:color="auto" w:val="clear"/>
-            <w:tcMar>
-              <w:top w:type="dxa" w:w="25"/>
-              <w:left w:type="dxa" w:w="80"/>
-              <w:bottom w:type="dxa" w:w="25"/>
-              <w:right w:type="dxa" w:w="80"/>
-            </w:tcMar>
-            <w:vAlign w:val="center"/>
-          </w:tcPr>
-          <w:p>
-            <w:pPr>
-              <w:spacing w:line="216" w:lineRule="auto"/>
-              <w:jc w:val="right"/>
-            </w:pPr>
-            <w:r>
-              <w:rPr>
-                <w:rFonts w:ascii="Arial" w:cs="Arial" w:eastAsia="Arial" w:hAnsi="Arial"/>
-                <w:b w:val="false"/>
-                <w:bCs w:val="false"/>
-                <w:color w:val="1A1A1A"/>
-                <w:sz w:val="13"/>
-                <w:szCs w:val="13"/>
-              </w:rPr>
-              <w:t xml:space="preserve">2,679</w:t>
-            </w:r>
-          </w:p>
-        </w:tc>
-        <w:tc>
-          <w:tcPr>
-            <w:tcW w:type="dxa" w:w="1200"/>
-            <w:tcBorders>
-              <w:top w:val="none" w:color="FFFFFF" w:sz="0"/>
-              <w:left w:val="none" w:color="FFFFFF" w:sz="0"/>
-              <w:bottom w:val="single" w:color="D5D9E0" w:sz="4"/>
-              <w:right w:val="none" w:color="FFFFFF" w:sz="0"/>
-            </w:tcBorders>
-            <w:shd w:fill="F7F8FB" w:color="auto" w:val="clear"/>
-            <w:tcMar>
-              <w:top w:type="dxa" w:w="25"/>
-              <w:left w:type="dxa" w:w="80"/>
-              <w:bottom w:type="dxa" w:w="25"/>
-              <w:right w:type="dxa" w:w="80"/>
-            </w:tcMar>
-            <w:vAlign w:val="center"/>
-          </w:tcPr>
-          <w:p>
-            <w:pPr>
-              <w:spacing w:line="216" w:lineRule="auto"/>
-              <w:jc w:val="right"/>
-            </w:pPr>
-            <w:r>
-              <w:rPr>
-                <w:rFonts w:ascii="Arial" w:cs="Arial" w:eastAsia="Arial" w:hAnsi="Arial"/>
-                <w:b w:val="false"/>
-                <w:bCs w:val="false"/>
-                <w:color w:val="1A1A1A"/>
-                <w:sz w:val="13"/>
-                <w:szCs w:val="13"/>
-              </w:rPr>
-              <w:t xml:space="preserve">2,734</w:t>
-            </w:r>
-          </w:p>
-        </w:tc>
-        <w:tc>
-          <w:tcPr>
-            <w:tcW w:type="dxa" w:w="1000"/>
-            <w:tcBorders>
-              <w:top w:val="none" w:color="FFFFFF" w:sz="0"/>
-              <w:left w:val="none" w:color="FFFFFF" w:sz="0"/>
-              <w:bottom w:val="single" w:color="D5D9E0" w:sz="4"/>
-              <w:right w:val="none" w:color="FFFFFF" w:sz="0"/>
-            </w:tcBorders>
-            <w:shd w:fill="F7F8FB" w:color="auto" w:val="clear"/>
-            <w:tcMar>
-              <w:top w:type="dxa" w:w="25"/>
-              <w:left w:type="dxa" w:w="80"/>
-              <w:bottom w:type="dxa" w:w="25"/>
-              <w:right w:type="dxa" w:w="80"/>
-            </w:tcMar>
-            <w:vAlign w:val="center"/>
-          </w:tcPr>
-          <w:p>
-            <w:pPr>
-              <w:spacing w:line="216" w:lineRule="auto"/>
-              <w:jc w:val="right"/>
-            </w:pPr>
-            <w:r>
-              <w:rPr>
-                <w:rFonts w:ascii="Arial" w:cs="Arial" w:eastAsia="Arial" w:hAnsi="Arial"/>
-                <w:b w:val="false"/>
-                <w:bCs w:val="false"/>
-                <w:color w:val="1A1A1A"/>
-                <w:sz w:val="13"/>
-                <w:szCs w:val="13"/>
-              </w:rPr>
-              <w:t xml:space="preserve">−23.1%</w:t>
+                <w:color w:val="14284B"/>
+                <w:sz w:val="14"/>
+                <w:szCs w:val="14"/>
+              </w:rPr>
+              <w:t xml:space="preserve">Figure M1: </w:t>
+            </w:r>
+            <w:r>
+              <w:rPr>
+                <w:rFonts w:ascii="Arial" w:cs="Arial" w:eastAsia="Arial" w:hAnsi="Arial"/>
+                <w:color w:val="14284B"/>
+                <w:sz w:val="14"/>
+                <w:szCs w:val="14"/>
+              </w:rPr>
+              <w:t xml:space="preserve">Target price distribution in 10,000 simulations</w:t>
+            </w:r>
+          </w:p>
+          <w:p>
+            <w:pPr>
+              <w:spacing w:after="20" w:before="0" w:line="240" w:lineRule="auto"/>
+            </w:pPr>
+            <w:r>
+              <w:drawing>
+                <wp:inline distT="0" distB="0" distL="0" distR="0">
+                  <wp:extent cx="2257425" cy="1876425"/>
+                  <wp:effectExtent t="0" r="0" b="0" l="0"/>
+                  <wp:docPr id="1" name="" descr="" title=""/>
+                  <wp:cNvGraphicFramePr>
+                    <a:graphicFrameLocks xmlns:a="http://schemas.openxmlformats.org/drawingml/2006/main" noChangeAspect="1"/>
+                  </wp:cNvGraphicFramePr>
+                  <a:graphic xmlns:a="http://schemas.openxmlformats.org/drawingml/2006/main">
+                    <a:graphicData uri="http://schemas.openxmlformats.org/drawingml/2006/picture">
+                      <pic:pic xmlns:pic="http://schemas.openxmlformats.org/drawingml/2006/picture">
+                        <pic:nvPicPr>
+                          <pic:cNvPr id="0" name="" descr=""/>
+                          <pic:cNvPicPr>
+                            <a:picLocks noChangeAspect="1" noChangeArrowheads="1"/>
+                          </pic:cNvPicPr>
+                        </pic:nvPicPr>
+                        <pic:blipFill>
+                          <a:blip r:embed="rId9" cstate="none"/>
+                          <a:srcRect/>
+                          <a:stretch>
+                            <a:fillRect/>
+                          </a:stretch>
+                        </pic:blipFill>
+                        <pic:spPr bwMode="auto">
+                          <a:xfrm>
+                            <a:off x="0" y="0"/>
+                            <a:ext cx="2257425" cy="1876425"/>
+                          </a:xfrm>
+                          <a:prstGeom prst="rect">
+                            <a:avLst/>
+                          </a:prstGeom>
+                        </pic:spPr>
+                      </pic:pic>
+                    </a:graphicData>
+                  </a:graphic>
+                </wp:inline>
+              </w:drawing>
+            </w:r>
+          </w:p>
+          <w:p>
+            <w:pPr>
+              <w:spacing w:after="0" w:before="10" w:line="216" w:lineRule="auto"/>
+            </w:pPr>
+            <w:r>
+              <w:rPr>
+                <w:rFonts w:ascii="Arial" w:cs="Arial" w:eastAsia="Arial" w:hAnsi="Arial"/>
+                <w:color w:val="5F5F5F"/>
+                <w:sz w:val="11"/>
+                <w:szCs w:val="11"/>
+              </w:rPr>
+              <w:t xml:space="preserve">100% of simulations stay below the CLP 3,555 price. Source: Team analysis.</w:t>
             </w:r>
           </w:p>
         </w:tc>
       </w:tr>
     </w:tbl>
+    <w:p>
+      <w:pPr>
+        <w:spacing w:after="0" w:before="10" w:line="216" w:lineRule="auto"/>
+      </w:pPr>
+      <w:r>
+        <w:rPr>
+          <w:rFonts w:ascii="Arial" w:cs="Arial" w:eastAsia="Arial" w:hAnsi="Arial"/>
+          <w:color w:val="5F5F5F"/>
+          <w:sz w:val="11"/>
+          <w:szCs w:val="11"/>
+        </w:rPr>
+        <w:t xml:space="preserve">Assumptions: 10,000 iterations, seed 42. Triangular distributions (minimum, base, maximum) with the 4Q23–2Q26 historical extremes of the Risks tornado: EBITDA margin 75.8%/80.6%/81.3%; occupancy 95.1%/95.6%/96.6%; same-store rent 2027–28 3.7%/5.4%/9.4%; tenant sales 3.7%/3.7%/9.9% (0.5 correlation with rent, Gaussian copula; the rest independent); real growth 2029–31 between the Note 11 floor and ceiling; visitors 5.6%/9.8%/17.3%; maintenance + IT capex 4.8%/5.5%/6.6% of revenue; nominal g 2.5%/3.0%/4.0%. WACC: normal parallel shift, mean 0, standard deviation 50 bp, truncated at ±150 bp. Long-run tax rate 27% (the cut to 23% is excluded). Target price = 80% DCF + 20% fixed multiples (CLP 2,951). With every variable at its base value the simulation reproduces the CLP 1,859 DCF and the CLP 2,077 target. Source: Team analysis.</w:t>
+      </w:r>
+    </w:p>
     <w:tbl>
       <w:tblPr>
         <w:tblW w:type="dxa" w:w="10666"/>
@@ -40504,7 +41012,7 @@
                           </pic:cNvPicPr>
                         </pic:nvPicPr>
                         <pic:blipFill>
-                          <a:blip r:embed="rId9" cstate="none"/>
+                          <a:blip r:embed="rId10" cstate="none"/>
                           <a:srcRect/>
                           <a:stretch>
                             <a:fillRect/>

</xml_diff>

<commit_message>
Word del informe consolidado regenerado (ES/EN) con los histogramas en rojo
Co-Authored-By: Claude Sonnet 5.5 <noreply@anthropic.com>
Claude-Session: https://claude.ai/code/session_0188QZHBkA8n5QL7BtmFakQg
</commit_message>
<xml_diff>
--- a/secciones/valuacion/anexo/Mallplaza_Valuacion_EN_Anexo.docx
+++ b/secciones/valuacion/anexo/Mallplaza_Valuacion_EN_Anexo.docx
@@ -6436,7 +6436,7 @@
           <w:sz w:val="11"/>
           <w:szCs w:val="11"/>
         </w:rPr>
-        <w:t xml:space="preserve">Terminal value at 31-Dec-31: CLP 7,292,232 MM (implied terminal cap rate 11.3%; implied LTM EV/EBITDA of EV 9.9x). Bloomberg net debt (CLP 1,311,569 MM, used in multiples) differs from net financial debt by IFRS 16 lease liabilities (CLP 25,828 MM at Jun-26). Source: model v4, DCF and Sensibilidad sheets; 2,190 MM shares.</w:t>
+        <w:t xml:space="preserve">Terminal value at 31-Dec-31: CLP 7,292,232 MM (implied terminal cap rate 11.3%; implied LTM EV/EBITDA of EV 9.9x). Bloomberg net debt (CLP 1,311,569 MM, used in multiples) differs from net financial debt by IFRS 16 lease liabilities (CLP 25,828 MM at Jun-26). Source: Team analysis; 2,190 MM shares.</w:t>
       </w:r>
     </w:p>
     <w:p>
@@ -13039,7 +13039,7 @@
                 <w:sz w:val="14"/>
                 <w:szCs w:val="14"/>
               </w:rPr>
-              <w:t xml:space="preserve">Terminal value starts from 2031E revenue (982,334), adds the maturation of the expansion already funded (+40,818) and indexes for inflation (+30,006) to 1,030,197; 2032E FCFF = NOPAT 594,732 + D&amp;A 7,249 − maintenance 56,661 − working capital 4,682 = 540,638.</w:t>
+              <w:t xml:space="preserve">Terminal value starts from 2031E revenue (982,334), adds the maturation of the expansion already funded (+17,858; the gross mature revenue, 40,818, includes 22,960 already in 2031E) and indexes for inflation (+30,006) to 1,030,197; 2032E FCFF = NOPAT 594,732 + D&amp;A 7,249 − maintenance 56,661 − working capital 4,682 = 540,638.</w:t>
             </w:r>
           </w:p>
         </w:tc>
@@ -13396,7 +13396,7 @@
                 <w:sz w:val="13"/>
                 <w:szCs w:val="13"/>
               </w:rPr>
-              <w:t xml:space="preserve">Base revenue (calendar year)</w:t>
+              <w:t xml:space="preserve">Base revenue (calendar year; the 2H26E column shows full-year 2026E)</w:t>
             </w:r>
           </w:p>
         </w:tc>
@@ -13650,7 +13650,7 @@
                 <w:sz w:val="13"/>
                 <w:szCs w:val="13"/>
               </w:rPr>
-              <w:t xml:space="preserve">Total revenue growth</w:t>
+              <w:t xml:space="preserve">Total revenue growth (calendar year)</w:t>
             </w:r>
           </w:p>
         </w:tc>
@@ -16008,7 +16008,7 @@
                 <w:sz w:val="13"/>
                 <w:szCs w:val="13"/>
               </w:rPr>
-              <w:t xml:space="preserve">201,656</w:t>
+              <w:t xml:space="preserve">294,192</w:t>
             </w:r>
           </w:p>
         </w:tc>
@@ -16044,7 +16044,7 @@
                 <w:sz w:val="13"/>
                 <w:szCs w:val="13"/>
               </w:rPr>
-              <w:t xml:space="preserve">60,085</w:t>
+              <w:t xml:space="preserve">250,711</w:t>
             </w:r>
           </w:p>
         </w:tc>
@@ -16080,7 +16080,7 @@
                 <w:sz w:val="13"/>
                 <w:szCs w:val="13"/>
               </w:rPr>
-              <w:t xml:space="preserve">−98,172</w:t>
+              <w:t xml:space="preserve">98,172</w:t>
             </w:r>
           </w:p>
         </w:tc>
@@ -16116,7 +16116,7 @@
                 <w:sz w:val="13"/>
                 <w:szCs w:val="13"/>
               </w:rPr>
-              <w:t xml:space="preserve">−101,117</w:t>
+              <w:t xml:space="preserve">101,117</w:t>
             </w:r>
           </w:p>
         </w:tc>
@@ -16152,7 +16152,7 @@
                 <w:sz w:val="13"/>
                 <w:szCs w:val="13"/>
               </w:rPr>
-              <w:t xml:space="preserve">−104,151</w:t>
+              <w:t xml:space="preserve">104,151</w:t>
             </w:r>
           </w:p>
         </w:tc>
@@ -17685,7 +17685,7 @@
                       <w:sz w:val="13"/>
                       <w:szCs w:val="13"/>
                     </w:rPr>
-                    <w:t xml:space="preserve">50% in t−2 / 50% en t−1</w:t>
+                    <w:t xml:space="preserve">50% in t−2 / 50% in t−1</w:t>
                   </w:r>
                 </w:p>
               </w:tc>
@@ -18820,7 +18820,7 @@
           <w:sz w:val="16"/>
           <w:szCs w:val="16"/>
         </w:rPr>
-        <w:t xml:space="preserve">D. DEBT SCHEDULE (CLP MM; DEUDA SHEET)</w:t>
+        <w:t xml:space="preserve">D. DEBT SCHEDULE (CLP MM)</w:t>
       </w:r>
     </w:p>
     <w:tbl>
@@ -21385,7 +21385,7 @@
           <w:sz w:val="11"/>
           <w:szCs w:val="11"/>
         </w:rPr>
-        <w:t xml:space="preserve">Net debt(t) = net debt(t−1) − FCFF + financial cost and UF indexation after tax + ordinary dividends + additional distribution, which takes net debt to the target path (2.36x → 3.5x). Financial cost: 3.08% of net debt + 25 bp per turn above 2.36x; UF indexation on 79% of debt at 3.0%. Bond maturities: Figure 6. Source: model v4 (2Q26 Release; Dec-25 financials; Exhibits v7).</w:t>
+        <w:t xml:space="preserve">Net debt(t) = net debt(t−1) − FCFF + financial cost and UF indexation after tax + ordinary dividends + additional distribution, which takes net debt to the target path (2.36x → 3.5x). Financial cost: 3.08% of net debt + 25 bp per turn above 2.36x; UF indexation on 79% of debt at 3.0%. Bond maturities: Figure 6. Source: 2Q26 Release; Dec-25 financials; Team analysis.</w:t>
       </w:r>
     </w:p>
     <w:p>
@@ -22569,7 +22569,7 @@
                 <w:sz w:val="13"/>
                 <w:szCs w:val="13"/>
               </w:rPr>
-              <w:t xml:space="preserve">Cencosud Shopping</w:t>
+              <w:t xml:space="preserve">Cenco Malls</w:t>
             </w:r>
           </w:p>
         </w:tc>
@@ -27919,7 +27919,7 @@
           <w:sz w:val="11"/>
           <w:szCs w:val="11"/>
         </w:rPr>
-        <w:t xml:space="preserve">Bridge: 14.36x × LTM EBITDA CLP 544,935 MM = EV 7,825,944 − Bloomberg net debt 1,311,569 − minorities 50,841 = CLP 2,951 per share (2,190 MM shares). Fibra Danhos is excluded because of its FIBRA regime and because it has no beta in the WACC; IRSA reports under IAS 29. Source: Bloomberg; model v4, Comparables and Precio_Objetivo sheets; Figuras_Valuacion, V7.</w:t>
+        <w:t xml:space="preserve">Bridge: 14.36x × LTM EBITDA CLP 544,935 MM = EV 7,825,944 − Bloomberg net debt 1,311,569 − minorities 50,841 = CLP 2,951 per share (2,190 MM shares). Fibra Danhos is excluded because of its FIBRA regime and because it has no beta in the WACC; IRSA reports under IAS 29. Source: Bloomberg; Team analysis.</w:t>
       </w:r>
     </w:p>
     <w:p>
@@ -27954,7 +27954,7 @@
           <w:sz w:val="14"/>
           <w:szCs w:val="14"/>
         </w:rPr>
-        <w:t xml:space="preserve">No scenario or alternative method reaches the CLP 3,555 price. Scenarios are computed with the DCF replica (it reproduces the base value exactly) and the target price keeps the 80% DCF weight and the multiples value of CLP 2,951. Bear is everything going wrong at once; bull, everything going right; both use the same levers as the Risks tornado. Probability weighting is a cross-check: the target price remains the base-case one.</w:t>
+        <w:t xml:space="preserve">No scenario or alternative method reaches the CLP 3,555 price. Scenarios are computed with the DCF replica (it reproduces the base value exactly) and the target price keeps the 80% DCF weight and the multiples value of CLP 2,951. Bear is everything going wrong at once; bull, everything going right; both use the same levers as the Risks tornado.</w:t>
       </w:r>
     </w:p>
     <w:p>
@@ -28910,7 +28910,7 @@
           <w:sz w:val="11"/>
           <w:szCs w:val="11"/>
         </w:rPr>
-        <w:t xml:space="preserve">Bear and bull are illustrative extreme scenarios with no probability assigned: the probability of outcomes is estimated with the simulation in the next section. Source: Team analysis.</w:t>
+        <w:t xml:space="preserve">Bear and bull are illustrative extreme scenarios with no probability assigned: the probability of outcomes is estimated with the simulation in the next section (Figure M1). Source: Team analysis.</w:t>
       </w:r>
     </w:p>
     <w:p>
@@ -29801,7 +29801,7 @@
           <w:sz w:val="11"/>
           <w:szCs w:val="11"/>
         </w:rPr>
-        <w:t xml:space="preserve">Assumptions: 10,000 iterations, seed 42. Triangular distributions (minimum, base, maximum) with the 4Q23–2Q26 historical extremes of the Risks tornado: EBITDA margin 75.8%/80.6%/81.3%; occupancy 95.1%/95.6%/96.6%; same-store rent 2027–28 3.7%/5.4%/9.4%; tenant sales 3.7%/3.7%/9.9% (0.5 correlation with rent, Gaussian copula; the rest independent); real growth 2029–31 between the Note 11 floor and ceiling; visitors 5.6%/9.8%/17.3%; maintenance + IT capex 4.8%/5.5%/6.6% of revenue; nominal g 2.5%/3.0%/4.0%. WACC: normal parallel shift, mean 0, standard deviation 50 bp, truncated at ±150 bp. Long-run tax rate 27% (the cut to 23% is excluded). Target price = 80% DCF + 20% fixed multiples (CLP 2,951). With every variable at its base value the simulation reproduces the CLP 1,859 DCF and the CLP 2,077 target. Source: Team analysis.</w:t>
+        <w:t xml:space="preserve">Assumptions: 10,000 iterations, seed 42; triangular distributions (min/base/max, 4Q23–2Q26 extremes of the Risks tornado): EBITDA margin 75.8%/80.6%/81.3%, occupancy 95.1%/95.6%/96.6%, same-store rent 2027–28 3.7%/5.4%/9.4%, tenant sales 3.7%/3.7%/9.9% (0.5 correlation with rent, Gaussian copula; the rest independent), visitors 5.6%/9.8%/17.3%, maintenance + IT capex 4.8%/5.5%/6.6%, nominal g 2.5%/3.0%/4.0%, real growth 2029–31 between the Note 11 floor and ceiling. WACC: normal shift, mean 0, standard deviation 50 bp, truncated at ±150 bp. Tax 27% (no cut to 23%). Target = 80% DCF + 20% fixed multiples (CLP 2,951); with everything at base it reproduces the CLP 1,859 DCF and CLP 2,077 target. Source: Team analysis.</w:t>
       </w:r>
     </w:p>
     <w:tbl>
@@ -32848,7 +32848,7 @@
                 <w:sz w:val="16"/>
                 <w:szCs w:val="16"/>
               </w:rPr>
-              <w:t xml:space="preserve">D. SENSITIVITIES REQUESTED BY THE REVIEW (OUTSIDE THE BASE CASE)</w:t>
+              <w:t xml:space="preserve">D. ADDITIONAL SENSITIVITIES (OUTSIDE THE BASE CASE)</w:t>
             </w:r>
           </w:p>
           <w:tbl>
@@ -33607,7 +33607,7 @@
           <w:sz w:val="11"/>
           <w:szCs w:val="11"/>
         </w:rPr>
-        <w:t xml:space="preserve">Bear and bull: every lever at the historical minimum/maximum of the Risks tornado (4Q23 and 3Q25 earnings releases for margin; Note 11 for long-run real growth) in all years; the bull does not recompute the WACC tax shield. Section D: each year's rate scaled by the EBITDA mix by country (Chile ~70%, Peru ~20%, Colombia ~10%; PwC Tax Summaries, Peru reviewed 13-Jul-26, Colombia 21-Jul-26); Gran Plaza at our implied cap rate (10.1%) − price paid, applying an EBITDA cap rate to an NOI. None changes the recommendation. Source: DCF v4 replica (escenarios_dcf.py); model v4, APV, Sensibilidad (table 2, static) and DCF sheets; Figuras_Valuacion, WACC_Construccion and V6.</w:t>
+        <w:t xml:space="preserve">Bear and bull: every lever at the historical minimum/maximum of the Risks tornado (4Q23 and 3Q25 earnings releases for margin; Note 11 for long-run real growth) in all years; the bull does not recompute the WACC tax shield. Section D: each year's rate scaled by the EBITDA mix by country (Chile ~70%, Peru ~20%, Colombia ~10%; PwC Tax Summaries, Peru reviewed 13-Jul-26, Colombia 21-Jul-26); Gran Plaza at our implied cap rate (10.1%) − price paid, applying an EBITDA cap rate to an NOI. None changes the recommendation. Source: Team analysis.</w:t>
       </w:r>
     </w:p>
     <w:p>
@@ -33979,7 +33979,7 @@
                 <w:sz w:val="13"/>
                 <w:szCs w:val="13"/>
               </w:rPr>
-              <w:t xml:space="preserve">Tasa_WACC (FFCF)</w:t>
+              <w:t xml:space="preserve">Team analysis</w:t>
             </w:r>
           </w:p>
         </w:tc>
@@ -34457,7 +34457,7 @@
                 <w:sz w:val="13"/>
                 <w:szCs w:val="13"/>
               </w:rPr>
-              <w:t xml:space="preserve">Real Kd: latest UF bond coupon</w:t>
+              <w:t xml:space="preserve">Real Kd: real coupon of the latest UF issue (base case)</w:t>
             </w:r>
           </w:p>
         </w:tc>
@@ -34787,7 +34787,7 @@
                 <w:sz w:val="13"/>
                 <w:szCs w:val="13"/>
               </w:rPr>
-              <w:t xml:space="preserve">Gross debt / market cap (current structure, CLP MM)</w:t>
+              <w:t xml:space="preserve">Gross debt (Dec-25) / market cap at CLP 3,610 per share (current structure, CLP bn)</w:t>
             </w:r>
           </w:p>
         </w:tc>
@@ -34823,7 +34823,7 @@
                 <w:sz w:val="13"/>
                 <w:szCs w:val="13"/>
               </w:rPr>
-              <w:t xml:space="preserve">1,579 / 7,906 (thousands)</w:t>
+              <w:t xml:space="preserve">1,579 / 7,906</w:t>
             </w:r>
           </w:p>
         </w:tc>
@@ -34859,7 +34859,7 @@
                 <w:sz w:val="13"/>
                 <w:szCs w:val="13"/>
               </w:rPr>
-              <w:t xml:space="preserve">Tasa_WACC (FFCF)</w:t>
+              <w:t xml:space="preserve">Team analysis</w:t>
             </w:r>
           </w:p>
         </w:tc>
@@ -35364,7 +35364,7 @@
                 <w:sz w:val="13"/>
                 <w:szCs w:val="13"/>
               </w:rPr>
-              <w:t xml:space="preserve">Cencosud Shopping</w:t>
+              <w:t xml:space="preserve">Cenco Malls</w:t>
             </w:r>
           </w:p>
         </w:tc>
@@ -36651,7 +36651,7 @@
           <w:sz w:val="11"/>
           <w:szCs w:val="11"/>
         </w:rPr>
-        <w:t xml:space="preserve">Source: Bloomberg (betas), Tasa_WACC. Costa Verde is excluded because it is not in the comparables set.</w:t>
+        <w:t xml:space="preserve">Source: Bloomberg (betas); Team analysis. Costa Verde is excluded because it is not in the comparables set.</w:t>
       </w:r>
     </w:p>
     <w:p>
@@ -41045,7 +41045,7 @@
                 <w:sz w:val="11"/>
                 <w:szCs w:val="11"/>
               </w:rPr>
-              <w:t xml:space="preserve">Control: the replica matches the WACC sheet of model v4 (0 bp difference in every period). Source: Damodaran; Bloomberg; Central Bank of Chile; Team analysis.</w:t>
+              <w:t xml:space="preserve">Control: the DCF replica matches the WACC calculation (0 bp difference in every period). Source: Damodaran; Bloomberg; Central Bank of Chile; Team analysis.</w:t>
             </w:r>
           </w:p>
         </w:tc>
@@ -41680,7 +41680,7 @@
                 <w:sz w:val="11"/>
                 <w:szCs w:val="11"/>
               </w:rPr>
-              <w:t xml:space="preserve">Source: Central Bank of Chile, Informativo Diario 2-Jul-26; DCF v4 replica with the WACC shifted in every period.</w:t>
+              <w:t xml:space="preserve">Source: Central Bank of Chile, Informativo Diario 2-Jul-26; Team analysis (WACC shifted in every period).</w:t>
             </w:r>
           </w:p>
         </w:tc>

</xml_diff>